<commit_message>
Updates Manuscript and Figure Captions
</commit_message>
<xml_diff>
--- a/products/manuscript/Manuscript.docx
+++ b/products/manuscript/Manuscript.docx
@@ -18,6 +18,32 @@
         <w:t xml:space="preserve">Rebecca Basta and Riley Herber</w:t>
       </w:r>
     </w:p>
+    <w:sdt>
+      <w:sdtPr>
+        <w:docPartObj>
+          <w:docPartGallery w:val="Table of Contents"/>
+          <w:docPartUnique/>
+        </w:docPartObj>
+      </w:sdtPr>
+      <w:sdtContent>
+        <w:p>
+          <w:pPr>
+            <w:pStyle w:val="TOCHeading"/>
+          </w:pPr>
+          <w:r>
+            <w:t xml:space="preserve">Table of contents</w:t>
+          </w:r>
+        </w:p>
+        <w:p>
+          <w:r>
+            <w:fldChar w:fldCharType="begin" w:dirty="true"/>
+            <w:instrText xml:space="preserve">TOC \o "1-3" \h \z \u</w:instrText>
+            <w:fldChar w:fldCharType="separate"/>
+            <w:fldChar w:fldCharType="end"/>
+          </w:r>
+        </w:p>
+      </w:sdtContent>
+    </w:sdt>
     <w:p>
       <w:pPr>
         <w:pStyle w:val="FirstParagraph"/>
@@ -508,7 +534,7 @@
     </w:p>
     <w:bookmarkEnd w:id="29"/>
     <w:bookmarkEnd w:id="30"/>
-    <w:bookmarkStart w:id="56" w:name="results"/>
+    <w:bookmarkStart w:id="60" w:name="results"/>
     <w:p>
       <w:pPr>
         <w:pStyle w:val="Heading1"/>
@@ -517,7 +543,7 @@
         <w:t xml:space="preserve">4. Results</w:t>
       </w:r>
     </w:p>
-    <w:bookmarkStart w:id="53" w:name="exploratorydescriptive-analysis"/>
+    <w:bookmarkStart w:id="57" w:name="exploratorydescriptive-analysis"/>
     <w:p>
       <w:pPr>
         <w:pStyle w:val="Heading2"/>
@@ -1185,7 +1211,7 @@
                     <w:jc w:val="center"/>
                   </w:pPr>
                   <w:r>
-                    <w:t xml:space="preserve">4057</w:t>
+                    <w:t xml:space="preserve">6396</w:t>
                   </w:r>
                 </w:p>
               </w:tc>
@@ -1198,7 +1224,7 @@
                     <w:jc w:val="center"/>
                   </w:pPr>
                   <w:r>
-                    <w:t xml:space="preserve">173</w:t>
+                    <w:t xml:space="preserve">9</w:t>
                   </w:r>
                 </w:p>
               </w:tc>
@@ -1211,7 +1237,7 @@
                     <w:jc w:val="center"/>
                   </w:pPr>
                   <w:r>
-                    <w:t xml:space="preserve">0.0426423</w:t>
+                    <w:t xml:space="preserve">0.0014071</w:t>
                   </w:r>
                 </w:p>
               </w:tc>
@@ -1239,7 +1265,7 @@
                     <w:jc w:val="center"/>
                   </w:pPr>
                   <w:r>
-                    <w:t xml:space="preserve">3818</w:t>
+                    <w:t xml:space="preserve">6361</w:t>
                   </w:r>
                 </w:p>
               </w:tc>
@@ -1252,7 +1278,7 @@
                     <w:jc w:val="center"/>
                   </w:pPr>
                   <w:r>
-                    <w:t xml:space="preserve">211</w:t>
+                    <w:t xml:space="preserve">4</w:t>
                   </w:r>
                 </w:p>
               </w:tc>
@@ -1265,7 +1291,7 @@
                     <w:jc w:val="center"/>
                   </w:pPr>
                   <w:r>
-                    <w:t xml:space="preserve">0.0552645</w:t>
+                    <w:t xml:space="preserve">0.0006288</w:t>
                   </w:r>
                 </w:p>
               </w:tc>
@@ -1278,24 +1304,6 @@
     </w:tbl>
     <w:p>
       <w:pPr>
-        <w:pStyle w:val="BodyText"/>
-      </w:pPr>
-      <w:r>
-        <w:rPr>
-          <w:b/>
-          <w:bCs/>
-        </w:rPr>
-        <w:t xml:space="preserve">?@fig-med-frequency</w:t>
-      </w:r>
-      <w:r>
-        <w:t xml:space="preserve"> </w:t>
-      </w:r>
-      <w:r>
-        <w:t xml:space="preserve">shows hows that many particpants used cardiovascular and anticoagulations medicine. The highest used medications were anticoagulants and opioids.</w:t>
-      </w:r>
-    </w:p>
-    <w:p>
-      <w:pPr>
         <w:pStyle w:val="SourceCode"/>
       </w:pPr>
       <w:r>
@@ -1362,7 +1370,7 @@
         <w:rPr>
           <w:rStyle w:val="StringTok"/>
         </w:rPr>
-        <w:t xml:space="preserve">"unadjusted-perscriptoin-frequency.png"</w:t>
+        <w:t xml:space="preserve">"perscriptoin-frequency.png"</w:t>
       </w:r>
       <w:r>
         <w:rPr>
@@ -1384,7 +1392,7 @@
       <w:tr>
         <w:tc>
           <w:tcPr/>
-          <w:bookmarkStart w:id="47" w:name="fig-med-mortality"/>
+          <w:bookmarkStart w:id="47" w:name="fig-med-frequency"/>
           <w:p>
             <w:pPr>
               <w:pStyle w:val="Compact"/>
@@ -1400,7 +1408,7 @@
                     <a:graphicData uri="http://schemas.openxmlformats.org/drawingml/2006/picture">
                       <pic:pic>
                         <pic:nvPicPr>
-                          <pic:cNvPr descr="../../results/figures/unadjusted-perscriptoin-frequency.png" id="46" name="Picture"/>
+                          <pic:cNvPr descr="../../results/figures/perscriptoin-frequency.png" id="46" name="Picture"/>
                           <pic:cNvPicPr>
                             <a:picLocks noChangeArrowheads="1" noChangeAspect="1"/>
                           </pic:cNvPicPr>
@@ -1443,7 +1451,7 @@
               <w:pStyle w:val="ImageCaption"/>
             </w:pPr>
             <w:r>
-              <w:t xml:space="preserve">Figure 4: 30-day mortality rate by medication class (unadjusted)</w:t>
+              <w:t xml:space="preserve">Figure 4: Medication Class Use</w:t>
             </w:r>
           </w:p>
           <w:bookmarkEnd w:id="47"/>
@@ -1454,7 +1462,7 @@
       <w:pPr>
         <w:pStyle w:val="BodyText"/>
       </w:pPr>
-      <w:hyperlink w:anchor="fig-med-mortality">
+      <w:hyperlink w:anchor="fig-med-frequency">
         <w:r>
           <w:rPr>
             <w:rStyle w:val="Hyperlink"/>
@@ -1466,7 +1474,84 @@
         <w:t xml:space="preserve"> </w:t>
       </w:r>
       <w:r>
-        <w:t xml:space="preserve">suggests that patients who received vasopressors had the highest 30-day mortality rate, followed by opioids. In contrast, patients receiving ACE inhibitors, statins, and calcium channel blockers had lower mortality rates than those who did not receive them, likely reflecting their use in more stable patients. These associations are unadjusted and largely reflect disease severity rather than direct drug effects. Sicker patients tend to receive more aggressive medications and have worse outcomes.</w:t>
+        <w:t xml:space="preserve">shows hows that many particpants used cardiovascular and anticoagulations medicine. The highest used medications were anticoagulants and opioids.</w:t>
+      </w:r>
+    </w:p>
+    <w:p>
+      <w:pPr>
+        <w:pStyle w:val="SourceCode"/>
+      </w:pPr>
+      <w:r>
+        <w:rPr>
+          <w:rStyle w:val="NormalTok"/>
+        </w:rPr>
+        <w:t xml:space="preserve">knitr</w:t>
+      </w:r>
+      <w:r>
+        <w:rPr>
+          <w:rStyle w:val="SpecialCharTok"/>
+        </w:rPr>
+        <w:t xml:space="preserve">::</w:t>
+      </w:r>
+      <w:r>
+        <w:rPr>
+          <w:rStyle w:val="FunctionTok"/>
+        </w:rPr>
+        <w:t xml:space="preserve">include_graphics</w:t>
+      </w:r>
+      <w:r>
+        <w:rPr>
+          <w:rStyle w:val="NormalTok"/>
+        </w:rPr>
+        <w:t xml:space="preserve">(</w:t>
+      </w:r>
+      <w:r>
+        <w:rPr>
+          <w:rStyle w:val="FunctionTok"/>
+        </w:rPr>
+        <w:t xml:space="preserve">here</w:t>
+      </w:r>
+      <w:r>
+        <w:rPr>
+          <w:rStyle w:val="NormalTok"/>
+        </w:rPr>
+        <w:t xml:space="preserve">(</w:t>
+      </w:r>
+      <w:r>
+        <w:rPr>
+          <w:rStyle w:val="StringTok"/>
+        </w:rPr>
+        <w:t xml:space="preserve">"results"</w:t>
+      </w:r>
+      <w:r>
+        <w:rPr>
+          <w:rStyle w:val="NormalTok"/>
+        </w:rPr>
+        <w:t xml:space="preserve">, </w:t>
+      </w:r>
+      <w:r>
+        <w:rPr>
+          <w:rStyle w:val="StringTok"/>
+        </w:rPr>
+        <w:t xml:space="preserve">"figures"</w:t>
+      </w:r>
+      <w:r>
+        <w:rPr>
+          <w:rStyle w:val="NormalTok"/>
+        </w:rPr>
+        <w:t xml:space="preserve">, </w:t>
+      </w:r>
+      <w:r>
+        <w:rPr>
+          <w:rStyle w:val="StringTok"/>
+        </w:rPr>
+        <w:t xml:space="preserve">"unadjusted-perscriptoin-frequency.png"</w:t>
+      </w:r>
+      <w:r>
+        <w:rPr>
+          <w:rStyle w:val="NormalTok"/>
+        </w:rPr>
+        <w:t xml:space="preserve">))</w:t>
       </w:r>
     </w:p>
     <w:tbl>
@@ -1482,1816 +1567,7 @@
       <w:tr>
         <w:tc>
           <w:tcPr/>
-          <w:bookmarkStart w:id="48" w:name="tbl-med-mortality-summary"/>
-          <w:p>
-            <w:pPr>
-              <w:jc w:val="center"/>
-            </w:pPr>
-            <w:pPr>
-              <w:jc w:val="left"/>
-              <w:spacing w:before="200"/>
-              <w:pStyle w:val="ImageCaption"/>
-            </w:pPr>
-            <w:r>
-              <w:t xml:space="preserve">Table 2</w:t>
-            </w:r>
-          </w:p>
-          <w:tbl>
-            <w:tblPr>
-              <w:tblStyle w:val="Table"/>
-              <w:tblW w:type="auto" w:w="0"/>
-              <w:tblLook w:firstRow="1" w:lastRow="0" w:firstColumn="0" w:lastColumn="0" w:noHBand="0" w:noVBand="0" w:val="0020"/>
-            </w:tblPr>
-            <w:tblGrid>
-              <w:gridCol w:w="1584"/>
-              <w:gridCol w:w="1584"/>
-              <w:gridCol w:w="1584"/>
-              <w:gridCol w:w="1584"/>
-              <w:gridCol w:w="1584"/>
-            </w:tblGrid>
-            <w:tr>
-              <w:trPr>
-                <w:tblHeader w:val="on"/>
-              </w:trPr>
-              <w:tc>
-                <w:tcPr/>
-                <w:p>
-                  <w:pPr>
-                    <w:pStyle w:val="Compact"/>
-                    <w:jc w:val="left"/>
-                    <w:jc w:val="center"/>
-                  </w:pPr>
-                  <w:r>
-                    <w:t xml:space="preserve">received</w:t>
-                  </w:r>
-                </w:p>
-              </w:tc>
-              <w:tc>
-                <w:tcPr/>
-                <w:p>
-                  <w:pPr>
-                    <w:pStyle w:val="Compact"/>
-                    <w:jc w:val="right"/>
-                    <w:jc w:val="center"/>
-                  </w:pPr>
-                  <w:r>
-                    <w:t xml:space="preserve">n</w:t>
-                  </w:r>
-                </w:p>
-              </w:tc>
-              <w:tc>
-                <w:tcPr/>
-                <w:p>
-                  <w:pPr>
-                    <w:pStyle w:val="Compact"/>
-                    <w:jc w:val="right"/>
-                    <w:jc w:val="center"/>
-                  </w:pPr>
-                  <w:r>
-                    <w:t xml:space="preserve">deaths</w:t>
-                  </w:r>
-                </w:p>
-              </w:tc>
-              <w:tc>
-                <w:tcPr/>
-                <w:p>
-                  <w:pPr>
-                    <w:pStyle w:val="Compact"/>
-                    <w:jc w:val="left"/>
-                    <w:jc w:val="center"/>
-                  </w:pPr>
-                  <w:r>
-                    <w:t xml:space="preserve">med_class</w:t>
-                  </w:r>
-                </w:p>
-              </w:tc>
-              <w:tc>
-                <w:tcPr/>
-                <w:p>
-                  <w:pPr>
-                    <w:pStyle w:val="Compact"/>
-                    <w:jc w:val="right"/>
-                    <w:jc w:val="center"/>
-                  </w:pPr>
-                  <w:r>
-                    <w:t xml:space="preserve">mort_rate</w:t>
-                  </w:r>
-                </w:p>
-              </w:tc>
-            </w:tr>
-            <w:tr>
-              <w:tc>
-                <w:tcPr/>
-                <w:p>
-                  <w:pPr>
-                    <w:pStyle w:val="Compact"/>
-                    <w:jc w:val="left"/>
-                    <w:jc w:val="center"/>
-                  </w:pPr>
-                  <w:r>
-                    <w:t xml:space="preserve">Not Received</w:t>
-                  </w:r>
-                </w:p>
-              </w:tc>
-              <w:tc>
-                <w:tcPr/>
-                <w:p>
-                  <w:pPr>
-                    <w:pStyle w:val="Compact"/>
-                    <w:jc w:val="right"/>
-                    <w:jc w:val="center"/>
-                  </w:pPr>
-                  <w:r>
-                    <w:t xml:space="preserve">4984</w:t>
-                  </w:r>
-                </w:p>
-              </w:tc>
-              <w:tc>
-                <w:tcPr/>
-                <w:p>
-                  <w:pPr>
-                    <w:pStyle w:val="Compact"/>
-                    <w:jc w:val="right"/>
-                    <w:jc w:val="center"/>
-                  </w:pPr>
-                  <w:r>
-                    <w:t xml:space="preserve">256</w:t>
-                  </w:r>
-                </w:p>
-              </w:tc>
-              <w:tc>
-                <w:tcPr/>
-                <w:p>
-                  <w:pPr>
-                    <w:pStyle w:val="Compact"/>
-                    <w:jc w:val="left"/>
-                    <w:jc w:val="center"/>
-                  </w:pPr>
-                  <w:r>
-                    <w:t xml:space="preserve">Antiplatelet</w:t>
-                  </w:r>
-                </w:p>
-              </w:tc>
-              <w:tc>
-                <w:tcPr/>
-                <w:p>
-                  <w:pPr>
-                    <w:pStyle w:val="Compact"/>
-                    <w:jc w:val="right"/>
-                    <w:jc w:val="center"/>
-                  </w:pPr>
-                  <w:r>
-                    <w:t xml:space="preserve">0.0513644</w:t>
-                  </w:r>
-                </w:p>
-              </w:tc>
-            </w:tr>
-            <w:tr>
-              <w:tc>
-                <w:tcPr/>
-                <w:p>
-                  <w:pPr>
-                    <w:pStyle w:val="Compact"/>
-                    <w:jc w:val="left"/>
-                    <w:jc w:val="center"/>
-                  </w:pPr>
-                  <w:r>
-                    <w:t xml:space="preserve">Received</w:t>
-                  </w:r>
-                </w:p>
-              </w:tc>
-              <w:tc>
-                <w:tcPr/>
-                <w:p>
-                  <w:pPr>
-                    <w:pStyle w:val="Compact"/>
-                    <w:jc w:val="right"/>
-                    <w:jc w:val="center"/>
-                  </w:pPr>
-                  <w:r>
-                    <w:t xml:space="preserve">2891</w:t>
-                  </w:r>
-                </w:p>
-              </w:tc>
-              <w:tc>
-                <w:tcPr/>
-                <w:p>
-                  <w:pPr>
-                    <w:pStyle w:val="Compact"/>
-                    <w:jc w:val="right"/>
-                    <w:jc w:val="center"/>
-                  </w:pPr>
-                  <w:r>
-                    <w:t xml:space="preserve">128</w:t>
-                  </w:r>
-                </w:p>
-              </w:tc>
-              <w:tc>
-                <w:tcPr/>
-                <w:p>
-                  <w:pPr>
-                    <w:pStyle w:val="Compact"/>
-                    <w:jc w:val="left"/>
-                    <w:jc w:val="center"/>
-                  </w:pPr>
-                  <w:r>
-                    <w:t xml:space="preserve">Antiplatelet</w:t>
-                  </w:r>
-                </w:p>
-              </w:tc>
-              <w:tc>
-                <w:tcPr/>
-                <w:p>
-                  <w:pPr>
-                    <w:pStyle w:val="Compact"/>
-                    <w:jc w:val="right"/>
-                    <w:jc w:val="center"/>
-                  </w:pPr>
-                  <w:r>
-                    <w:t xml:space="preserve">0.0442753</w:t>
-                  </w:r>
-                </w:p>
-              </w:tc>
-            </w:tr>
-            <w:tr>
-              <w:tc>
-                <w:tcPr/>
-                <w:p>
-                  <w:pPr>
-                    <w:pStyle w:val="Compact"/>
-                    <w:jc w:val="left"/>
-                    <w:jc w:val="center"/>
-                  </w:pPr>
-                  <w:r>
-                    <w:t xml:space="preserve">Not Received</w:t>
-                  </w:r>
-                </w:p>
-              </w:tc>
-              <w:tc>
-                <w:tcPr/>
-                <w:p>
-                  <w:pPr>
-                    <w:pStyle w:val="Compact"/>
-                    <w:jc w:val="right"/>
-                    <w:jc w:val="center"/>
-                  </w:pPr>
-                  <w:r>
-                    <w:t xml:space="preserve">1714</w:t>
-                  </w:r>
-                </w:p>
-              </w:tc>
-              <w:tc>
-                <w:tcPr/>
-                <w:p>
-                  <w:pPr>
-                    <w:pStyle w:val="Compact"/>
-                    <w:jc w:val="right"/>
-                    <w:jc w:val="center"/>
-                  </w:pPr>
-                  <w:r>
-                    <w:t xml:space="preserve">60</w:t>
-                  </w:r>
-                </w:p>
-              </w:tc>
-              <w:tc>
-                <w:tcPr/>
-                <w:p>
-                  <w:pPr>
-                    <w:pStyle w:val="Compact"/>
-                    <w:jc w:val="left"/>
-                    <w:jc w:val="center"/>
-                  </w:pPr>
-                  <w:r>
-                    <w:t xml:space="preserve">Anticoagulant</w:t>
-                  </w:r>
-                </w:p>
-              </w:tc>
-              <w:tc>
-                <w:tcPr/>
-                <w:p>
-                  <w:pPr>
-                    <w:pStyle w:val="Compact"/>
-                    <w:jc w:val="right"/>
-                    <w:jc w:val="center"/>
-                  </w:pPr>
-                  <w:r>
-                    <w:t xml:space="preserve">0.0350058</w:t>
-                  </w:r>
-                </w:p>
-              </w:tc>
-            </w:tr>
-            <w:tr>
-              <w:tc>
-                <w:tcPr/>
-                <w:p>
-                  <w:pPr>
-                    <w:pStyle w:val="Compact"/>
-                    <w:jc w:val="left"/>
-                    <w:jc w:val="center"/>
-                  </w:pPr>
-                  <w:r>
-                    <w:t xml:space="preserve">Received</w:t>
-                  </w:r>
-                </w:p>
-              </w:tc>
-              <w:tc>
-                <w:tcPr/>
-                <w:p>
-                  <w:pPr>
-                    <w:pStyle w:val="Compact"/>
-                    <w:jc w:val="right"/>
-                    <w:jc w:val="center"/>
-                  </w:pPr>
-                  <w:r>
-                    <w:t xml:space="preserve">6161</w:t>
-                  </w:r>
-                </w:p>
-              </w:tc>
-              <w:tc>
-                <w:tcPr/>
-                <w:p>
-                  <w:pPr>
-                    <w:pStyle w:val="Compact"/>
-                    <w:jc w:val="right"/>
-                    <w:jc w:val="center"/>
-                  </w:pPr>
-                  <w:r>
-                    <w:t xml:space="preserve">324</w:t>
-                  </w:r>
-                </w:p>
-              </w:tc>
-              <w:tc>
-                <w:tcPr/>
-                <w:p>
-                  <w:pPr>
-                    <w:pStyle w:val="Compact"/>
-                    <w:jc w:val="left"/>
-                    <w:jc w:val="center"/>
-                  </w:pPr>
-                  <w:r>
-                    <w:t xml:space="preserve">Anticoagulant</w:t>
-                  </w:r>
-                </w:p>
-              </w:tc>
-              <w:tc>
-                <w:tcPr/>
-                <w:p>
-                  <w:pPr>
-                    <w:pStyle w:val="Compact"/>
-                    <w:jc w:val="right"/>
-                    <w:jc w:val="center"/>
-                  </w:pPr>
-                  <w:r>
-                    <w:t xml:space="preserve">0.0525889</w:t>
-                  </w:r>
-                </w:p>
-              </w:tc>
-            </w:tr>
-            <w:tr>
-              <w:tc>
-                <w:tcPr/>
-                <w:p>
-                  <w:pPr>
-                    <w:pStyle w:val="Compact"/>
-                    <w:jc w:val="left"/>
-                    <w:jc w:val="center"/>
-                  </w:pPr>
-                  <w:r>
-                    <w:t xml:space="preserve">Not Received</w:t>
-                  </w:r>
-                </w:p>
-              </w:tc>
-              <w:tc>
-                <w:tcPr/>
-                <w:p>
-                  <w:pPr>
-                    <w:pStyle w:val="Compact"/>
-                    <w:jc w:val="right"/>
-                    <w:jc w:val="center"/>
-                  </w:pPr>
-                  <w:r>
-                    <w:t xml:space="preserve">6408</w:t>
-                  </w:r>
-                </w:p>
-              </w:tc>
-              <w:tc>
-                <w:tcPr/>
-                <w:p>
-                  <w:pPr>
-                    <w:pStyle w:val="Compact"/>
-                    <w:jc w:val="right"/>
-                    <w:jc w:val="center"/>
-                  </w:pPr>
-                  <w:r>
-                    <w:t xml:space="preserve">341</w:t>
-                  </w:r>
-                </w:p>
-              </w:tc>
-              <w:tc>
-                <w:tcPr/>
-                <w:p>
-                  <w:pPr>
-                    <w:pStyle w:val="Compact"/>
-                    <w:jc w:val="left"/>
-                    <w:jc w:val="center"/>
-                  </w:pPr>
-                  <w:r>
-                    <w:t xml:space="preserve">Ace Inhibitor</w:t>
-                  </w:r>
-                </w:p>
-              </w:tc>
-              <w:tc>
-                <w:tcPr/>
-                <w:p>
-                  <w:pPr>
-                    <w:pStyle w:val="Compact"/>
-                    <w:jc w:val="right"/>
-                    <w:jc w:val="center"/>
-                  </w:pPr>
-                  <w:r>
-                    <w:t xml:space="preserve">0.0532147</w:t>
-                  </w:r>
-                </w:p>
-              </w:tc>
-            </w:tr>
-            <w:tr>
-              <w:tc>
-                <w:tcPr/>
-                <w:p>
-                  <w:pPr>
-                    <w:pStyle w:val="Compact"/>
-                    <w:jc w:val="left"/>
-                    <w:jc w:val="center"/>
-                  </w:pPr>
-                  <w:r>
-                    <w:t xml:space="preserve">Received</w:t>
-                  </w:r>
-                </w:p>
-              </w:tc>
-              <w:tc>
-                <w:tcPr/>
-                <w:p>
-                  <w:pPr>
-                    <w:pStyle w:val="Compact"/>
-                    <w:jc w:val="right"/>
-                    <w:jc w:val="center"/>
-                  </w:pPr>
-                  <w:r>
-                    <w:t xml:space="preserve">1467</w:t>
-                  </w:r>
-                </w:p>
-              </w:tc>
-              <w:tc>
-                <w:tcPr/>
-                <w:p>
-                  <w:pPr>
-                    <w:pStyle w:val="Compact"/>
-                    <w:jc w:val="right"/>
-                    <w:jc w:val="center"/>
-                  </w:pPr>
-                  <w:r>
-                    <w:t xml:space="preserve">43</w:t>
-                  </w:r>
-                </w:p>
-              </w:tc>
-              <w:tc>
-                <w:tcPr/>
-                <w:p>
-                  <w:pPr>
-                    <w:pStyle w:val="Compact"/>
-                    <w:jc w:val="left"/>
-                    <w:jc w:val="center"/>
-                  </w:pPr>
-                  <w:r>
-                    <w:t xml:space="preserve">Ace Inhibitor</w:t>
-                  </w:r>
-                </w:p>
-              </w:tc>
-              <w:tc>
-                <w:tcPr/>
-                <w:p>
-                  <w:pPr>
-                    <w:pStyle w:val="Compact"/>
-                    <w:jc w:val="right"/>
-                    <w:jc w:val="center"/>
-                  </w:pPr>
-                  <w:r>
-                    <w:t xml:space="preserve">0.0293115</w:t>
-                  </w:r>
-                </w:p>
-              </w:tc>
-            </w:tr>
-            <w:tr>
-              <w:tc>
-                <w:tcPr/>
-                <w:p>
-                  <w:pPr>
-                    <w:pStyle w:val="Compact"/>
-                    <w:jc w:val="left"/>
-                    <w:jc w:val="center"/>
-                  </w:pPr>
-                  <w:r>
-                    <w:t xml:space="preserve">Not Received</w:t>
-                  </w:r>
-                </w:p>
-              </w:tc>
-              <w:tc>
-                <w:tcPr/>
-                <w:p>
-                  <w:pPr>
-                    <w:pStyle w:val="Compact"/>
-                    <w:jc w:val="right"/>
-                    <w:jc w:val="center"/>
-                  </w:pPr>
-                  <w:r>
-                    <w:t xml:space="preserve">6510</w:t>
-                  </w:r>
-                </w:p>
-              </w:tc>
-              <w:tc>
-                <w:tcPr/>
-                <w:p>
-                  <w:pPr>
-                    <w:pStyle w:val="Compact"/>
-                    <w:jc w:val="right"/>
-                    <w:jc w:val="center"/>
-                  </w:pPr>
-                  <w:r>
-                    <w:t xml:space="preserve">330</w:t>
-                  </w:r>
-                </w:p>
-              </w:tc>
-              <w:tc>
-                <w:tcPr/>
-                <w:p>
-                  <w:pPr>
-                    <w:pStyle w:val="Compact"/>
-                    <w:jc w:val="left"/>
-                    <w:jc w:val="center"/>
-                  </w:pPr>
-                  <w:r>
-                    <w:t xml:space="preserve">Calcium Channel Blocker</w:t>
-                  </w:r>
-                </w:p>
-              </w:tc>
-              <w:tc>
-                <w:tcPr/>
-                <w:p>
-                  <w:pPr>
-                    <w:pStyle w:val="Compact"/>
-                    <w:jc w:val="right"/>
-                    <w:jc w:val="center"/>
-                  </w:pPr>
-                  <w:r>
-                    <w:t xml:space="preserve">0.0506912</w:t>
-                  </w:r>
-                </w:p>
-              </w:tc>
-            </w:tr>
-            <w:tr>
-              <w:tc>
-                <w:tcPr/>
-                <w:p>
-                  <w:pPr>
-                    <w:pStyle w:val="Compact"/>
-                    <w:jc w:val="left"/>
-                    <w:jc w:val="center"/>
-                  </w:pPr>
-                  <w:r>
-                    <w:t xml:space="preserve">Received</w:t>
-                  </w:r>
-                </w:p>
-              </w:tc>
-              <w:tc>
-                <w:tcPr/>
-                <w:p>
-                  <w:pPr>
-                    <w:pStyle w:val="Compact"/>
-                    <w:jc w:val="right"/>
-                    <w:jc w:val="center"/>
-                  </w:pPr>
-                  <w:r>
-                    <w:t xml:space="preserve">1365</w:t>
-                  </w:r>
-                </w:p>
-              </w:tc>
-              <w:tc>
-                <w:tcPr/>
-                <w:p>
-                  <w:pPr>
-                    <w:pStyle w:val="Compact"/>
-                    <w:jc w:val="right"/>
-                    <w:jc w:val="center"/>
-                  </w:pPr>
-                  <w:r>
-                    <w:t xml:space="preserve">54</w:t>
-                  </w:r>
-                </w:p>
-              </w:tc>
-              <w:tc>
-                <w:tcPr/>
-                <w:p>
-                  <w:pPr>
-                    <w:pStyle w:val="Compact"/>
-                    <w:jc w:val="left"/>
-                    <w:jc w:val="center"/>
-                  </w:pPr>
-                  <w:r>
-                    <w:t xml:space="preserve">Calcium Channel Blocker</w:t>
-                  </w:r>
-                </w:p>
-              </w:tc>
-              <w:tc>
-                <w:tcPr/>
-                <w:p>
-                  <w:pPr>
-                    <w:pStyle w:val="Compact"/>
-                    <w:jc w:val="right"/>
-                    <w:jc w:val="center"/>
-                  </w:pPr>
-                  <w:r>
-                    <w:t xml:space="preserve">0.0395604</w:t>
-                  </w:r>
-                </w:p>
-              </w:tc>
-            </w:tr>
-            <w:tr>
-              <w:tc>
-                <w:tcPr/>
-                <w:p>
-                  <w:pPr>
-                    <w:pStyle w:val="Compact"/>
-                    <w:jc w:val="left"/>
-                    <w:jc w:val="center"/>
-                  </w:pPr>
-                  <w:r>
-                    <w:t xml:space="preserve">Not Received</w:t>
-                  </w:r>
-                </w:p>
-              </w:tc>
-              <w:tc>
-                <w:tcPr/>
-                <w:p>
-                  <w:pPr>
-                    <w:pStyle w:val="Compact"/>
-                    <w:jc w:val="right"/>
-                    <w:jc w:val="center"/>
-                  </w:pPr>
-                  <w:r>
-                    <w:t xml:space="preserve">5873</w:t>
-                  </w:r>
-                </w:p>
-              </w:tc>
-              <w:tc>
-                <w:tcPr/>
-                <w:p>
-                  <w:pPr>
-                    <w:pStyle w:val="Compact"/>
-                    <w:jc w:val="right"/>
-                    <w:jc w:val="center"/>
-                  </w:pPr>
-                  <w:r>
-                    <w:t xml:space="preserve">218</w:t>
-                  </w:r>
-                </w:p>
-              </w:tc>
-              <w:tc>
-                <w:tcPr/>
-                <w:p>
-                  <w:pPr>
-                    <w:pStyle w:val="Compact"/>
-                    <w:jc w:val="left"/>
-                    <w:jc w:val="center"/>
-                  </w:pPr>
-                  <w:r>
-                    <w:t xml:space="preserve">Diuretic</w:t>
-                  </w:r>
-                </w:p>
-              </w:tc>
-              <w:tc>
-                <w:tcPr/>
-                <w:p>
-                  <w:pPr>
-                    <w:pStyle w:val="Compact"/>
-                    <w:jc w:val="right"/>
-                    <w:jc w:val="center"/>
-                  </w:pPr>
-                  <w:r>
-                    <w:t xml:space="preserve">0.0371190</w:t>
-                  </w:r>
-                </w:p>
-              </w:tc>
-            </w:tr>
-            <w:tr>
-              <w:tc>
-                <w:tcPr/>
-                <w:p>
-                  <w:pPr>
-                    <w:pStyle w:val="Compact"/>
-                    <w:jc w:val="left"/>
-                    <w:jc w:val="center"/>
-                  </w:pPr>
-                  <w:r>
-                    <w:t xml:space="preserve">Received</w:t>
-                  </w:r>
-                </w:p>
-              </w:tc>
-              <w:tc>
-                <w:tcPr/>
-                <w:p>
-                  <w:pPr>
-                    <w:pStyle w:val="Compact"/>
-                    <w:jc w:val="right"/>
-                    <w:jc w:val="center"/>
-                  </w:pPr>
-                  <w:r>
-                    <w:t xml:space="preserve">2002</w:t>
-                  </w:r>
-                </w:p>
-              </w:tc>
-              <w:tc>
-                <w:tcPr/>
-                <w:p>
-                  <w:pPr>
-                    <w:pStyle w:val="Compact"/>
-                    <w:jc w:val="right"/>
-                    <w:jc w:val="center"/>
-                  </w:pPr>
-                  <w:r>
-                    <w:t xml:space="preserve">166</w:t>
-                  </w:r>
-                </w:p>
-              </w:tc>
-              <w:tc>
-                <w:tcPr/>
-                <w:p>
-                  <w:pPr>
-                    <w:pStyle w:val="Compact"/>
-                    <w:jc w:val="left"/>
-                    <w:jc w:val="center"/>
-                  </w:pPr>
-                  <w:r>
-                    <w:t xml:space="preserve">Diuretic</w:t>
-                  </w:r>
-                </w:p>
-              </w:tc>
-              <w:tc>
-                <w:tcPr/>
-                <w:p>
-                  <w:pPr>
-                    <w:pStyle w:val="Compact"/>
-                    <w:jc w:val="right"/>
-                    <w:jc w:val="center"/>
-                  </w:pPr>
-                  <w:r>
-                    <w:t xml:space="preserve">0.0829171</w:t>
-                  </w:r>
-                </w:p>
-              </w:tc>
-            </w:tr>
-            <w:tr>
-              <w:tc>
-                <w:tcPr/>
-                <w:p>
-                  <w:pPr>
-                    <w:pStyle w:val="Compact"/>
-                    <w:jc w:val="left"/>
-                    <w:jc w:val="center"/>
-                  </w:pPr>
-                  <w:r>
-                    <w:t xml:space="preserve">Not Received</w:t>
-                  </w:r>
-                </w:p>
-              </w:tc>
-              <w:tc>
-                <w:tcPr/>
-                <w:p>
-                  <w:pPr>
-                    <w:pStyle w:val="Compact"/>
-                    <w:jc w:val="right"/>
-                    <w:jc w:val="center"/>
-                  </w:pPr>
-                  <w:r>
-                    <w:t xml:space="preserve">4845</w:t>
-                  </w:r>
-                </w:p>
-              </w:tc>
-              <w:tc>
-                <w:tcPr/>
-                <w:p>
-                  <w:pPr>
-                    <w:pStyle w:val="Compact"/>
-                    <w:jc w:val="right"/>
-                    <w:jc w:val="center"/>
-                  </w:pPr>
-                  <w:r>
-                    <w:t xml:space="preserve">130</w:t>
-                  </w:r>
-                </w:p>
-              </w:tc>
-              <w:tc>
-                <w:tcPr/>
-                <w:p>
-                  <w:pPr>
-                    <w:pStyle w:val="Compact"/>
-                    <w:jc w:val="left"/>
-                    <w:jc w:val="center"/>
-                  </w:pPr>
-                  <w:r>
-                    <w:t xml:space="preserve">Antibiotic</w:t>
-                  </w:r>
-                </w:p>
-              </w:tc>
-              <w:tc>
-                <w:tcPr/>
-                <w:p>
-                  <w:pPr>
-                    <w:pStyle w:val="Compact"/>
-                    <w:jc w:val="right"/>
-                    <w:jc w:val="center"/>
-                  </w:pPr>
-                  <w:r>
-                    <w:t xml:space="preserve">0.0268318</w:t>
-                  </w:r>
-                </w:p>
-              </w:tc>
-            </w:tr>
-            <w:tr>
-              <w:tc>
-                <w:tcPr/>
-                <w:p>
-                  <w:pPr>
-                    <w:pStyle w:val="Compact"/>
-                    <w:jc w:val="left"/>
-                    <w:jc w:val="center"/>
-                  </w:pPr>
-                  <w:r>
-                    <w:t xml:space="preserve">Received</w:t>
-                  </w:r>
-                </w:p>
-              </w:tc>
-              <w:tc>
-                <w:tcPr/>
-                <w:p>
-                  <w:pPr>
-                    <w:pStyle w:val="Compact"/>
-                    <w:jc w:val="right"/>
-                    <w:jc w:val="center"/>
-                  </w:pPr>
-                  <w:r>
-                    <w:t xml:space="preserve">3030</w:t>
-                  </w:r>
-                </w:p>
-              </w:tc>
-              <w:tc>
-                <w:tcPr/>
-                <w:p>
-                  <w:pPr>
-                    <w:pStyle w:val="Compact"/>
-                    <w:jc w:val="right"/>
-                    <w:jc w:val="center"/>
-                  </w:pPr>
-                  <w:r>
-                    <w:t xml:space="preserve">254</w:t>
-                  </w:r>
-                </w:p>
-              </w:tc>
-              <w:tc>
-                <w:tcPr/>
-                <w:p>
-                  <w:pPr>
-                    <w:pStyle w:val="Compact"/>
-                    <w:jc w:val="left"/>
-                    <w:jc w:val="center"/>
-                  </w:pPr>
-                  <w:r>
-                    <w:t xml:space="preserve">Antibiotic</w:t>
-                  </w:r>
-                </w:p>
-              </w:tc>
-              <w:tc>
-                <w:tcPr/>
-                <w:p>
-                  <w:pPr>
-                    <w:pStyle w:val="Compact"/>
-                    <w:jc w:val="right"/>
-                    <w:jc w:val="center"/>
-                  </w:pPr>
-                  <w:r>
-                    <w:t xml:space="preserve">0.0838284</w:t>
-                  </w:r>
-                </w:p>
-              </w:tc>
-            </w:tr>
-            <w:tr>
-              <w:tc>
-                <w:tcPr/>
-                <w:p>
-                  <w:pPr>
-                    <w:pStyle w:val="Compact"/>
-                    <w:jc w:val="left"/>
-                    <w:jc w:val="center"/>
-                  </w:pPr>
-                  <w:r>
-                    <w:t xml:space="preserve">Not Received</w:t>
-                  </w:r>
-                </w:p>
-              </w:tc>
-              <w:tc>
-                <w:tcPr/>
-                <w:p>
-                  <w:pPr>
-                    <w:pStyle w:val="Compact"/>
-                    <w:jc w:val="right"/>
-                    <w:jc w:val="center"/>
-                  </w:pPr>
-                  <w:r>
-                    <w:t xml:space="preserve">5159</w:t>
-                  </w:r>
-                </w:p>
-              </w:tc>
-              <w:tc>
-                <w:tcPr/>
-                <w:p>
-                  <w:pPr>
-                    <w:pStyle w:val="Compact"/>
-                    <w:jc w:val="right"/>
-                    <w:jc w:val="center"/>
-                  </w:pPr>
-                  <w:r>
-                    <w:t xml:space="preserve">188</w:t>
-                  </w:r>
-                </w:p>
-              </w:tc>
-              <w:tc>
-                <w:tcPr/>
-                <w:p>
-                  <w:pPr>
-                    <w:pStyle w:val="Compact"/>
-                    <w:jc w:val="left"/>
-                    <w:jc w:val="center"/>
-                  </w:pPr>
-                  <w:r>
-                    <w:t xml:space="preserve">Insulin</w:t>
-                  </w:r>
-                </w:p>
-              </w:tc>
-              <w:tc>
-                <w:tcPr/>
-                <w:p>
-                  <w:pPr>
-                    <w:pStyle w:val="Compact"/>
-                    <w:jc w:val="right"/>
-                    <w:jc w:val="center"/>
-                  </w:pPr>
-                  <w:r>
-                    <w:t xml:space="preserve">0.0364412</w:t>
-                  </w:r>
-                </w:p>
-              </w:tc>
-            </w:tr>
-            <w:tr>
-              <w:tc>
-                <w:tcPr/>
-                <w:p>
-                  <w:pPr>
-                    <w:pStyle w:val="Compact"/>
-                    <w:jc w:val="left"/>
-                    <w:jc w:val="center"/>
-                  </w:pPr>
-                  <w:r>
-                    <w:t xml:space="preserve">Received</w:t>
-                  </w:r>
-                </w:p>
-              </w:tc>
-              <w:tc>
-                <w:tcPr/>
-                <w:p>
-                  <w:pPr>
-                    <w:pStyle w:val="Compact"/>
-                    <w:jc w:val="right"/>
-                    <w:jc w:val="center"/>
-                  </w:pPr>
-                  <w:r>
-                    <w:t xml:space="preserve">2716</w:t>
-                  </w:r>
-                </w:p>
-              </w:tc>
-              <w:tc>
-                <w:tcPr/>
-                <w:p>
-                  <w:pPr>
-                    <w:pStyle w:val="Compact"/>
-                    <w:jc w:val="right"/>
-                    <w:jc w:val="center"/>
-                  </w:pPr>
-                  <w:r>
-                    <w:t xml:space="preserve">196</w:t>
-                  </w:r>
-                </w:p>
-              </w:tc>
-              <w:tc>
-                <w:tcPr/>
-                <w:p>
-                  <w:pPr>
-                    <w:pStyle w:val="Compact"/>
-                    <w:jc w:val="left"/>
-                    <w:jc w:val="center"/>
-                  </w:pPr>
-                  <w:r>
-                    <w:t xml:space="preserve">Insulin</w:t>
-                  </w:r>
-                </w:p>
-              </w:tc>
-              <w:tc>
-                <w:tcPr/>
-                <w:p>
-                  <w:pPr>
-                    <w:pStyle w:val="Compact"/>
-                    <w:jc w:val="right"/>
-                    <w:jc w:val="center"/>
-                  </w:pPr>
-                  <w:r>
-                    <w:t xml:space="preserve">0.0721649</w:t>
-                  </w:r>
-                </w:p>
-              </w:tc>
-            </w:tr>
-            <w:tr>
-              <w:tc>
-                <w:tcPr/>
-                <w:p>
-                  <w:pPr>
-                    <w:pStyle w:val="Compact"/>
-                    <w:jc w:val="left"/>
-                    <w:jc w:val="center"/>
-                  </w:pPr>
-                  <w:r>
-                    <w:t xml:space="preserve">Not Received</w:t>
-                  </w:r>
-                </w:p>
-              </w:tc>
-              <w:tc>
-                <w:tcPr/>
-                <w:p>
-                  <w:pPr>
-                    <w:pStyle w:val="Compact"/>
-                    <w:jc w:val="right"/>
-                    <w:jc w:val="center"/>
-                  </w:pPr>
-                  <w:r>
-                    <w:t xml:space="preserve">3271</w:t>
-                  </w:r>
-                </w:p>
-              </w:tc>
-              <w:tc>
-                <w:tcPr/>
-                <w:p>
-                  <w:pPr>
-                    <w:pStyle w:val="Compact"/>
-                    <w:jc w:val="right"/>
-                    <w:jc w:val="center"/>
-                  </w:pPr>
-                  <w:r>
-                    <w:t xml:space="preserve">71</w:t>
-                  </w:r>
-                </w:p>
-              </w:tc>
-              <w:tc>
-                <w:tcPr/>
-                <w:p>
-                  <w:pPr>
-                    <w:pStyle w:val="Compact"/>
-                    <w:jc w:val="left"/>
-                    <w:jc w:val="center"/>
-                  </w:pPr>
-                  <w:r>
-                    <w:t xml:space="preserve">Opioid</w:t>
-                  </w:r>
-                </w:p>
-              </w:tc>
-              <w:tc>
-                <w:tcPr/>
-                <w:p>
-                  <w:pPr>
-                    <w:pStyle w:val="Compact"/>
-                    <w:jc w:val="right"/>
-                    <w:jc w:val="center"/>
-                  </w:pPr>
-                  <w:r>
-                    <w:t xml:space="preserve">0.0217059</w:t>
-                  </w:r>
-                </w:p>
-              </w:tc>
-            </w:tr>
-            <w:tr>
-              <w:tc>
-                <w:tcPr/>
-                <w:p>
-                  <w:pPr>
-                    <w:pStyle w:val="Compact"/>
-                    <w:jc w:val="left"/>
-                    <w:jc w:val="center"/>
-                  </w:pPr>
-                  <w:r>
-                    <w:t xml:space="preserve">Received</w:t>
-                  </w:r>
-                </w:p>
-              </w:tc>
-              <w:tc>
-                <w:tcPr/>
-                <w:p>
-                  <w:pPr>
-                    <w:pStyle w:val="Compact"/>
-                    <w:jc w:val="right"/>
-                    <w:jc w:val="center"/>
-                  </w:pPr>
-                  <w:r>
-                    <w:t xml:space="preserve">4604</w:t>
-                  </w:r>
-                </w:p>
-              </w:tc>
-              <w:tc>
-                <w:tcPr/>
-                <w:p>
-                  <w:pPr>
-                    <w:pStyle w:val="Compact"/>
-                    <w:jc w:val="right"/>
-                    <w:jc w:val="center"/>
-                  </w:pPr>
-                  <w:r>
-                    <w:t xml:space="preserve">313</w:t>
-                  </w:r>
-                </w:p>
-              </w:tc>
-              <w:tc>
-                <w:tcPr/>
-                <w:p>
-                  <w:pPr>
-                    <w:pStyle w:val="Compact"/>
-                    <w:jc w:val="left"/>
-                    <w:jc w:val="center"/>
-                  </w:pPr>
-                  <w:r>
-                    <w:t xml:space="preserve">Opioid</w:t>
-                  </w:r>
-                </w:p>
-              </w:tc>
-              <w:tc>
-                <w:tcPr/>
-                <w:p>
-                  <w:pPr>
-                    <w:pStyle w:val="Compact"/>
-                    <w:jc w:val="right"/>
-                    <w:jc w:val="center"/>
-                  </w:pPr>
-                  <w:r>
-                    <w:t xml:space="preserve">0.0679844</w:t>
-                  </w:r>
-                </w:p>
-              </w:tc>
-            </w:tr>
-            <w:tr>
-              <w:tc>
-                <w:tcPr/>
-                <w:p>
-                  <w:pPr>
-                    <w:pStyle w:val="Compact"/>
-                    <w:jc w:val="left"/>
-                    <w:jc w:val="center"/>
-                  </w:pPr>
-                  <w:r>
-                    <w:t xml:space="preserve">Not Received</w:t>
-                  </w:r>
-                </w:p>
-              </w:tc>
-              <w:tc>
-                <w:tcPr/>
-                <w:p>
-                  <w:pPr>
-                    <w:pStyle w:val="Compact"/>
-                    <w:jc w:val="right"/>
-                    <w:jc w:val="center"/>
-                  </w:pPr>
-                  <w:r>
-                    <w:t xml:space="preserve">7396</w:t>
-                  </w:r>
-                </w:p>
-              </w:tc>
-              <w:tc>
-                <w:tcPr/>
-                <w:p>
-                  <w:pPr>
-                    <w:pStyle w:val="Compact"/>
-                    <w:jc w:val="right"/>
-                    <w:jc w:val="center"/>
-                  </w:pPr>
-                  <w:r>
-                    <w:t xml:space="preserve">259</w:t>
-                  </w:r>
-                </w:p>
-              </w:tc>
-              <w:tc>
-                <w:tcPr/>
-                <w:p>
-                  <w:pPr>
-                    <w:pStyle w:val="Compact"/>
-                    <w:jc w:val="left"/>
-                    <w:jc w:val="center"/>
-                  </w:pPr>
-                  <w:r>
-                    <w:t xml:space="preserve">Vasopressor</w:t>
-                  </w:r>
-                </w:p>
-              </w:tc>
-              <w:tc>
-                <w:tcPr/>
-                <w:p>
-                  <w:pPr>
-                    <w:pStyle w:val="Compact"/>
-                    <w:jc w:val="right"/>
-                    <w:jc w:val="center"/>
-                  </w:pPr>
-                  <w:r>
-                    <w:t xml:space="preserve">0.0350189</w:t>
-                  </w:r>
-                </w:p>
-              </w:tc>
-            </w:tr>
-            <w:tr>
-              <w:tc>
-                <w:tcPr/>
-                <w:p>
-                  <w:pPr>
-                    <w:pStyle w:val="Compact"/>
-                    <w:jc w:val="left"/>
-                    <w:jc w:val="center"/>
-                  </w:pPr>
-                  <w:r>
-                    <w:t xml:space="preserve">Received</w:t>
-                  </w:r>
-                </w:p>
-              </w:tc>
-              <w:tc>
-                <w:tcPr/>
-                <w:p>
-                  <w:pPr>
-                    <w:pStyle w:val="Compact"/>
-                    <w:jc w:val="right"/>
-                    <w:jc w:val="center"/>
-                  </w:pPr>
-                  <w:r>
-                    <w:t xml:space="preserve">479</w:t>
-                  </w:r>
-                </w:p>
-              </w:tc>
-              <w:tc>
-                <w:tcPr/>
-                <w:p>
-                  <w:pPr>
-                    <w:pStyle w:val="Compact"/>
-                    <w:jc w:val="right"/>
-                    <w:jc w:val="center"/>
-                  </w:pPr>
-                  <w:r>
-                    <w:t xml:space="preserve">125</w:t>
-                  </w:r>
-                </w:p>
-              </w:tc>
-              <w:tc>
-                <w:tcPr/>
-                <w:p>
-                  <w:pPr>
-                    <w:pStyle w:val="Compact"/>
-                    <w:jc w:val="left"/>
-                    <w:jc w:val="center"/>
-                  </w:pPr>
-                  <w:r>
-                    <w:t xml:space="preserve">Vasopressor</w:t>
-                  </w:r>
-                </w:p>
-              </w:tc>
-              <w:tc>
-                <w:tcPr/>
-                <w:p>
-                  <w:pPr>
-                    <w:pStyle w:val="Compact"/>
-                    <w:jc w:val="right"/>
-                    <w:jc w:val="center"/>
-                  </w:pPr>
-                  <w:r>
-                    <w:t xml:space="preserve">0.2609603</w:t>
-                  </w:r>
-                </w:p>
-              </w:tc>
-            </w:tr>
-            <w:tr>
-              <w:tc>
-                <w:tcPr/>
-                <w:p>
-                  <w:pPr>
-                    <w:pStyle w:val="Compact"/>
-                    <w:jc w:val="left"/>
-                    <w:jc w:val="center"/>
-                  </w:pPr>
-                  <w:r>
-                    <w:t xml:space="preserve">Not Received</w:t>
-                  </w:r>
-                </w:p>
-              </w:tc>
-              <w:tc>
-                <w:tcPr/>
-                <w:p>
-                  <w:pPr>
-                    <w:pStyle w:val="Compact"/>
-                    <w:jc w:val="right"/>
-                    <w:jc w:val="center"/>
-                  </w:pPr>
-                  <w:r>
-                    <w:t xml:space="preserve">5427</w:t>
-                  </w:r>
-                </w:p>
-              </w:tc>
-              <w:tc>
-                <w:tcPr/>
-                <w:p>
-                  <w:pPr>
-                    <w:pStyle w:val="Compact"/>
-                    <w:jc w:val="right"/>
-                    <w:jc w:val="center"/>
-                  </w:pPr>
-                  <w:r>
-                    <w:t xml:space="preserve">133</w:t>
-                  </w:r>
-                </w:p>
-              </w:tc>
-              <w:tc>
-                <w:tcPr/>
-                <w:p>
-                  <w:pPr>
-                    <w:pStyle w:val="Compact"/>
-                    <w:jc w:val="left"/>
-                    <w:jc w:val="center"/>
-                  </w:pPr>
-                  <w:r>
-                    <w:t xml:space="preserve">Sedative</w:t>
-                  </w:r>
-                </w:p>
-              </w:tc>
-              <w:tc>
-                <w:tcPr/>
-                <w:p>
-                  <w:pPr>
-                    <w:pStyle w:val="Compact"/>
-                    <w:jc w:val="right"/>
-                    <w:jc w:val="center"/>
-                  </w:pPr>
-                  <w:r>
-                    <w:t xml:space="preserve">0.0245071</w:t>
-                  </w:r>
-                </w:p>
-              </w:tc>
-            </w:tr>
-            <w:tr>
-              <w:tc>
-                <w:tcPr/>
-                <w:p>
-                  <w:pPr>
-                    <w:pStyle w:val="Compact"/>
-                    <w:jc w:val="left"/>
-                    <w:jc w:val="center"/>
-                  </w:pPr>
-                  <w:r>
-                    <w:t xml:space="preserve">Received</w:t>
-                  </w:r>
-                </w:p>
-              </w:tc>
-              <w:tc>
-                <w:tcPr/>
-                <w:p>
-                  <w:pPr>
-                    <w:pStyle w:val="Compact"/>
-                    <w:jc w:val="right"/>
-                    <w:jc w:val="center"/>
-                  </w:pPr>
-                  <w:r>
-                    <w:t xml:space="preserve">2448</w:t>
-                  </w:r>
-                </w:p>
-              </w:tc>
-              <w:tc>
-                <w:tcPr/>
-                <w:p>
-                  <w:pPr>
-                    <w:pStyle w:val="Compact"/>
-                    <w:jc w:val="right"/>
-                    <w:jc w:val="center"/>
-                  </w:pPr>
-                  <w:r>
-                    <w:t xml:space="preserve">251</w:t>
-                  </w:r>
-                </w:p>
-              </w:tc>
-              <w:tc>
-                <w:tcPr/>
-                <w:p>
-                  <w:pPr>
-                    <w:pStyle w:val="Compact"/>
-                    <w:jc w:val="left"/>
-                    <w:jc w:val="center"/>
-                  </w:pPr>
-                  <w:r>
-                    <w:t xml:space="preserve">Sedative</w:t>
-                  </w:r>
-                </w:p>
-              </w:tc>
-              <w:tc>
-                <w:tcPr/>
-                <w:p>
-                  <w:pPr>
-                    <w:pStyle w:val="Compact"/>
-                    <w:jc w:val="right"/>
-                    <w:jc w:val="center"/>
-                  </w:pPr>
-                  <w:r>
-                    <w:t xml:space="preserve">0.1025327</w:t>
-                  </w:r>
-                </w:p>
-              </w:tc>
-            </w:tr>
-            <w:tr>
-              <w:tc>
-                <w:tcPr/>
-                <w:p>
-                  <w:pPr>
-                    <w:pStyle w:val="Compact"/>
-                    <w:jc w:val="left"/>
-                    <w:jc w:val="center"/>
-                  </w:pPr>
-                  <w:r>
-                    <w:t xml:space="preserve">Not Received</w:t>
-                  </w:r>
-                </w:p>
-              </w:tc>
-              <w:tc>
-                <w:tcPr/>
-                <w:p>
-                  <w:pPr>
-                    <w:pStyle w:val="Compact"/>
-                    <w:jc w:val="right"/>
-                    <w:jc w:val="center"/>
-                  </w:pPr>
-                  <w:r>
-                    <w:t xml:space="preserve">6659</w:t>
-                  </w:r>
-                </w:p>
-              </w:tc>
-              <w:tc>
-                <w:tcPr/>
-                <w:p>
-                  <w:pPr>
-                    <w:pStyle w:val="Compact"/>
-                    <w:jc w:val="right"/>
-                    <w:jc w:val="center"/>
-                  </w:pPr>
-                  <w:r>
-                    <w:t xml:space="preserve">291</w:t>
-                  </w:r>
-                </w:p>
-              </w:tc>
-              <w:tc>
-                <w:tcPr/>
-                <w:p>
-                  <w:pPr>
-                    <w:pStyle w:val="Compact"/>
-                    <w:jc w:val="left"/>
-                    <w:jc w:val="center"/>
-                  </w:pPr>
-                  <w:r>
-                    <w:t xml:space="preserve">Corticosteroid</w:t>
-                  </w:r>
-                </w:p>
-              </w:tc>
-              <w:tc>
-                <w:tcPr/>
-                <w:p>
-                  <w:pPr>
-                    <w:pStyle w:val="Compact"/>
-                    <w:jc w:val="right"/>
-                    <w:jc w:val="center"/>
-                  </w:pPr>
-                  <w:r>
-                    <w:t xml:space="preserve">0.0437003</w:t>
-                  </w:r>
-                </w:p>
-              </w:tc>
-            </w:tr>
-            <w:tr>
-              <w:tc>
-                <w:tcPr/>
-                <w:p>
-                  <w:pPr>
-                    <w:pStyle w:val="Compact"/>
-                    <w:jc w:val="left"/>
-                    <w:jc w:val="center"/>
-                  </w:pPr>
-                  <w:r>
-                    <w:t xml:space="preserve">Received</w:t>
-                  </w:r>
-                </w:p>
-              </w:tc>
-              <w:tc>
-                <w:tcPr/>
-                <w:p>
-                  <w:pPr>
-                    <w:pStyle w:val="Compact"/>
-                    <w:jc w:val="right"/>
-                    <w:jc w:val="center"/>
-                  </w:pPr>
-                  <w:r>
-                    <w:t xml:space="preserve">1216</w:t>
-                  </w:r>
-                </w:p>
-              </w:tc>
-              <w:tc>
-                <w:tcPr/>
-                <w:p>
-                  <w:pPr>
-                    <w:pStyle w:val="Compact"/>
-                    <w:jc w:val="right"/>
-                    <w:jc w:val="center"/>
-                  </w:pPr>
-                  <w:r>
-                    <w:t xml:space="preserve">93</w:t>
-                  </w:r>
-                </w:p>
-              </w:tc>
-              <w:tc>
-                <w:tcPr/>
-                <w:p>
-                  <w:pPr>
-                    <w:pStyle w:val="Compact"/>
-                    <w:jc w:val="left"/>
-                    <w:jc w:val="center"/>
-                  </w:pPr>
-                  <w:r>
-                    <w:t xml:space="preserve">Corticosteroid</w:t>
-                  </w:r>
-                </w:p>
-              </w:tc>
-              <w:tc>
-                <w:tcPr/>
-                <w:p>
-                  <w:pPr>
-                    <w:pStyle w:val="Compact"/>
-                    <w:jc w:val="right"/>
-                    <w:jc w:val="center"/>
-                  </w:pPr>
-                  <w:r>
-                    <w:t xml:space="preserve">0.0764803</w:t>
-                  </w:r>
-                </w:p>
-              </w:tc>
-            </w:tr>
-            <w:tr>
-              <w:tc>
-                <w:tcPr/>
-                <w:p>
-                  <w:pPr>
-                    <w:pStyle w:val="Compact"/>
-                    <w:jc w:val="left"/>
-                    <w:jc w:val="center"/>
-                  </w:pPr>
-                  <w:r>
-                    <w:t xml:space="preserve">Not Received</w:t>
-                  </w:r>
-                </w:p>
-              </w:tc>
-              <w:tc>
-                <w:tcPr/>
-                <w:p>
-                  <w:pPr>
-                    <w:pStyle w:val="Compact"/>
-                    <w:jc w:val="right"/>
-                    <w:jc w:val="center"/>
-                  </w:pPr>
-                  <w:r>
-                    <w:t xml:space="preserve">5077</w:t>
-                  </w:r>
-                </w:p>
-              </w:tc>
-              <w:tc>
-                <w:tcPr/>
-                <w:p>
-                  <w:pPr>
-                    <w:pStyle w:val="Compact"/>
-                    <w:jc w:val="right"/>
-                    <w:jc w:val="center"/>
-                  </w:pPr>
-                  <w:r>
-                    <w:t xml:space="preserve">267</w:t>
-                  </w:r>
-                </w:p>
-              </w:tc>
-              <w:tc>
-                <w:tcPr/>
-                <w:p>
-                  <w:pPr>
-                    <w:pStyle w:val="Compact"/>
-                    <w:jc w:val="left"/>
-                    <w:jc w:val="center"/>
-                  </w:pPr>
-                  <w:r>
-                    <w:t xml:space="preserve">Statin</w:t>
-                  </w:r>
-                </w:p>
-              </w:tc>
-              <w:tc>
-                <w:tcPr/>
-                <w:p>
-                  <w:pPr>
-                    <w:pStyle w:val="Compact"/>
-                    <w:jc w:val="right"/>
-                    <w:jc w:val="center"/>
-                  </w:pPr>
-                  <w:r>
-                    <w:t xml:space="preserve">0.0525901</w:t>
-                  </w:r>
-                </w:p>
-              </w:tc>
-            </w:tr>
-            <w:tr>
-              <w:tc>
-                <w:tcPr/>
-                <w:p>
-                  <w:pPr>
-                    <w:pStyle w:val="Compact"/>
-                    <w:jc w:val="left"/>
-                    <w:jc w:val="center"/>
-                  </w:pPr>
-                  <w:r>
-                    <w:t xml:space="preserve">Received</w:t>
-                  </w:r>
-                </w:p>
-              </w:tc>
-              <w:tc>
-                <w:tcPr/>
-                <w:p>
-                  <w:pPr>
-                    <w:pStyle w:val="Compact"/>
-                    <w:jc w:val="right"/>
-                    <w:jc w:val="center"/>
-                  </w:pPr>
-                  <w:r>
-                    <w:t xml:space="preserve">2798</w:t>
-                  </w:r>
-                </w:p>
-              </w:tc>
-              <w:tc>
-                <w:tcPr/>
-                <w:p>
-                  <w:pPr>
-                    <w:pStyle w:val="Compact"/>
-                    <w:jc w:val="right"/>
-                    <w:jc w:val="center"/>
-                  </w:pPr>
-                  <w:r>
-                    <w:t xml:space="preserve">117</w:t>
-                  </w:r>
-                </w:p>
-              </w:tc>
-              <w:tc>
-                <w:tcPr/>
-                <w:p>
-                  <w:pPr>
-                    <w:pStyle w:val="Compact"/>
-                    <w:jc w:val="left"/>
-                    <w:jc w:val="center"/>
-                  </w:pPr>
-                  <w:r>
-                    <w:t xml:space="preserve">Statin</w:t>
-                  </w:r>
-                </w:p>
-              </w:tc>
-              <w:tc>
-                <w:tcPr/>
-                <w:p>
-                  <w:pPr>
-                    <w:pStyle w:val="Compact"/>
-                    <w:jc w:val="right"/>
-                    <w:jc w:val="center"/>
-                  </w:pPr>
-                  <w:r>
-                    <w:t xml:space="preserve">0.0418156</w:t>
-                  </w:r>
-                </w:p>
-              </w:tc>
-            </w:tr>
-          </w:tbl>
-          <w:bookmarkEnd w:id="48"/>
-          <w:p/>
-        </w:tc>
-      </w:tr>
-    </w:tbl>
-    <w:p>
-      <w:pPr>
-        <w:pStyle w:val="BodyText"/>
-      </w:pPr>
-      <w:r>
-        <w:t xml:space="preserve">tbl-med-mortality-summary shows mortality rates were higher with patients taking vasopressors, sedatives, and diruetics; this could be because the severity of their illness.</w:t>
-      </w:r>
-    </w:p>
-    <w:p>
-      <w:pPr>
-        <w:pStyle w:val="SourceCode"/>
-      </w:pPr>
-      <w:r>
-        <w:rPr>
-          <w:rStyle w:val="NormalTok"/>
-        </w:rPr>
-        <w:t xml:space="preserve">knitr</w:t>
-      </w:r>
-      <w:r>
-        <w:rPr>
-          <w:rStyle w:val="SpecialCharTok"/>
-        </w:rPr>
-        <w:t xml:space="preserve">::</w:t>
-      </w:r>
-      <w:r>
-        <w:rPr>
-          <w:rStyle w:val="FunctionTok"/>
-        </w:rPr>
-        <w:t xml:space="preserve">include_graphics</w:t>
-      </w:r>
-      <w:r>
-        <w:rPr>
-          <w:rStyle w:val="NormalTok"/>
-        </w:rPr>
-        <w:t xml:space="preserve">(</w:t>
-      </w:r>
-      <w:r>
-        <w:rPr>
-          <w:rStyle w:val="FunctionTok"/>
-        </w:rPr>
-        <w:t xml:space="preserve">here</w:t>
-      </w:r>
-      <w:r>
-        <w:rPr>
-          <w:rStyle w:val="NormalTok"/>
-        </w:rPr>
-        <w:t xml:space="preserve">(</w:t>
-      </w:r>
-      <w:r>
-        <w:rPr>
-          <w:rStyle w:val="StringTok"/>
-        </w:rPr>
-        <w:t xml:space="preserve">"results"</w:t>
-      </w:r>
-      <w:r>
-        <w:rPr>
-          <w:rStyle w:val="NormalTok"/>
-        </w:rPr>
-        <w:t xml:space="preserve">, </w:t>
-      </w:r>
-      <w:r>
-        <w:rPr>
-          <w:rStyle w:val="StringTok"/>
-        </w:rPr>
-        <w:t xml:space="preserve">"figures"</w:t>
-      </w:r>
-      <w:r>
-        <w:rPr>
-          <w:rStyle w:val="NormalTok"/>
-        </w:rPr>
-        <w:t xml:space="preserve">, </w:t>
-      </w:r>
-      <w:r>
-        <w:rPr>
-          <w:rStyle w:val="StringTok"/>
-        </w:rPr>
-        <w:t xml:space="preserve">"polypharmacy-frequency.png"</w:t>
-      </w:r>
-      <w:r>
-        <w:rPr>
-          <w:rStyle w:val="NormalTok"/>
-        </w:rPr>
-        <w:t xml:space="preserve">))</w:t>
-      </w:r>
-    </w:p>
-    <w:tbl>
-      <w:tblPr>
-        <w:tblStyle w:val="Table"/>
-        <w:tblW w:type="pct" w:w="5000"/>
-        <w:tblLayout w:type="fixed"/>
-        <w:tblLook w:firstRow="0" w:lastRow="0" w:firstColumn="0" w:lastColumn="0" w:noHBand="0" w:noVBand="0" w:val="0000"/>
-      </w:tblPr>
-      <w:tblGrid>
-        <w:gridCol w:w="7920"/>
-      </w:tblGrid>
-      <w:tr>
-        <w:tc>
-          <w:tcPr/>
-          <w:bookmarkStart w:id="52" w:name="fig-polypharmacy-freq"/>
+          <w:bookmarkStart w:id="51" w:name="fig-med-mortality"/>
           <w:p>
             <w:pPr>
               <w:pStyle w:val="Compact"/>
@@ -3302,18 +1578,18 @@
                 <wp:inline>
                   <wp:extent cx="5334000" cy="3333749"/>
                   <wp:effectExtent b="0" l="0" r="0" t="0"/>
-                  <wp:docPr descr="" title="" id="50" name="Picture"/>
+                  <wp:docPr descr="" title="" id="49" name="Picture"/>
                   <a:graphic>
                     <a:graphicData uri="http://schemas.openxmlformats.org/drawingml/2006/picture">
                       <pic:pic>
                         <pic:nvPicPr>
-                          <pic:cNvPr descr="../../results/figures/polypharmacy-frequency.png" id="51" name="Picture"/>
+                          <pic:cNvPr descr="../../results/figures/unadjusted-perscriptoin-frequency.png" id="50" name="Picture"/>
                           <pic:cNvPicPr>
                             <a:picLocks noChangeArrowheads="1" noChangeAspect="1"/>
                           </pic:cNvPicPr>
                         </pic:nvPicPr>
                         <pic:blipFill>
-                          <a:blip r:embed="rId49"/>
+                          <a:blip r:embed="rId48"/>
                           <a:stretch>
                             <a:fillRect/>
                           </a:stretch>
@@ -3350,10 +1626,10 @@
               <w:pStyle w:val="ImageCaption"/>
             </w:pPr>
             <w:r>
-              <w:t xml:space="preserve">Figure 5: Number of medication classes received vs. 30-day mortality</w:t>
+              <w:t xml:space="preserve">Figure 5: 30-day mortality rate by medication class (unadjusted)</w:t>
             </w:r>
           </w:p>
-          <w:bookmarkEnd w:id="52"/>
+          <w:bookmarkEnd w:id="51"/>
         </w:tc>
       </w:tr>
     </w:tbl>
@@ -3361,7 +1637,7 @@
       <w:pPr>
         <w:pStyle w:val="BodyText"/>
       </w:pPr>
-      <w:hyperlink w:anchor="fig-polypharmacy-freq">
+      <w:hyperlink w:anchor="fig-med-mortality">
         <w:r>
           <w:rPr>
             <w:rStyle w:val="Hyperlink"/>
@@ -3373,11 +1649,1125 @@
         <w:t xml:space="preserve"> </w:t>
       </w:r>
       <w:r>
+        <w:t xml:space="preserve">suggests that patients who received vasopressors had the highest 30-day mortality rate, followed by opioids. In contrast, patients receiving ACE inhibitors, statins, and calcium channel blockers had lower mortality rates than those who did not receive them, likely reflecting their use in more stable patients. These associations are unadjusted and largely reflect disease severity rather than direct drug effects. Sicker patients tend to receive more aggressive medications and have worse outcomes.</w:t>
+      </w:r>
+    </w:p>
+    <w:tbl>
+      <w:tblPr>
+        <w:tblStyle w:val="Table"/>
+        <w:tblW w:type="pct" w:w="5000"/>
+        <w:tblLayout w:type="fixed"/>
+        <w:tblLook w:firstRow="0" w:lastRow="0" w:firstColumn="0" w:lastColumn="0" w:noHBand="0" w:noVBand="0" w:val="0000"/>
+      </w:tblPr>
+      <w:tblGrid>
+        <w:gridCol w:w="7920"/>
+      </w:tblGrid>
+      <w:tr>
+        <w:tc>
+          <w:tcPr/>
+          <w:bookmarkStart w:id="52" w:name="tbl-med-mortality-summary"/>
+          <w:p>
+            <w:pPr>
+              <w:jc w:val="center"/>
+            </w:pPr>
+            <w:pPr>
+              <w:jc w:val="left"/>
+              <w:spacing w:before="200"/>
+              <w:pStyle w:val="ImageCaption"/>
+            </w:pPr>
+            <w:r>
+              <w:t xml:space="preserve">Table 2</w:t>
+            </w:r>
+          </w:p>
+          <w:tbl>
+            <w:tblPr>
+              <w:tblStyle w:val="Table"/>
+              <w:tblW w:type="auto" w:w="0"/>
+              <w:tblLook w:firstRow="1" w:lastRow="0" w:firstColumn="0" w:lastColumn="0" w:noHBand="0" w:noVBand="0" w:val="0020"/>
+            </w:tblPr>
+            <w:tblGrid>
+              <w:gridCol w:w="1584"/>
+              <w:gridCol w:w="1584"/>
+              <w:gridCol w:w="1584"/>
+              <w:gridCol w:w="1584"/>
+              <w:gridCol w:w="1584"/>
+            </w:tblGrid>
+            <w:tr>
+              <w:trPr>
+                <w:tblHeader w:val="on"/>
+              </w:trPr>
+              <w:tc>
+                <w:tcPr/>
+                <w:p>
+                  <w:pPr>
+                    <w:pStyle w:val="Compact"/>
+                    <w:jc w:val="left"/>
+                    <w:jc w:val="center"/>
+                  </w:pPr>
+                  <w:r>
+                    <w:t xml:space="preserve">received</w:t>
+                  </w:r>
+                </w:p>
+              </w:tc>
+              <w:tc>
+                <w:tcPr/>
+                <w:p>
+                  <w:pPr>
+                    <w:pStyle w:val="Compact"/>
+                    <w:jc w:val="right"/>
+                    <w:jc w:val="center"/>
+                  </w:pPr>
+                  <w:r>
+                    <w:t xml:space="preserve">n</w:t>
+                  </w:r>
+                </w:p>
+              </w:tc>
+              <w:tc>
+                <w:tcPr/>
+                <w:p>
+                  <w:pPr>
+                    <w:pStyle w:val="Compact"/>
+                    <w:jc w:val="right"/>
+                    <w:jc w:val="center"/>
+                  </w:pPr>
+                  <w:r>
+                    <w:t xml:space="preserve">deaths</w:t>
+                  </w:r>
+                </w:p>
+              </w:tc>
+              <w:tc>
+                <w:tcPr/>
+                <w:p>
+                  <w:pPr>
+                    <w:pStyle w:val="Compact"/>
+                    <w:jc w:val="left"/>
+                    <w:jc w:val="center"/>
+                  </w:pPr>
+                  <w:r>
+                    <w:t xml:space="preserve">med_class</w:t>
+                  </w:r>
+                </w:p>
+              </w:tc>
+              <w:tc>
+                <w:tcPr/>
+                <w:p>
+                  <w:pPr>
+                    <w:pStyle w:val="Compact"/>
+                    <w:jc w:val="right"/>
+                    <w:jc w:val="center"/>
+                  </w:pPr>
+                  <w:r>
+                    <w:t xml:space="preserve">mort_rate</w:t>
+                  </w:r>
+                </w:p>
+              </w:tc>
+            </w:tr>
+            <w:tr>
+              <w:tc>
+                <w:tcPr/>
+                <w:p>
+                  <w:pPr>
+                    <w:pStyle w:val="Compact"/>
+                    <w:jc w:val="left"/>
+                    <w:jc w:val="center"/>
+                  </w:pPr>
+                  <w:r>
+                    <w:t xml:space="preserve">Not Received</w:t>
+                  </w:r>
+                </w:p>
+              </w:tc>
+              <w:tc>
+                <w:tcPr/>
+                <w:p>
+                  <w:pPr>
+                    <w:pStyle w:val="Compact"/>
+                    <w:jc w:val="right"/>
+                    <w:jc w:val="center"/>
+                  </w:pPr>
+                  <w:r>
+                    <w:t xml:space="preserve">6083</w:t>
+                  </w:r>
+                </w:p>
+              </w:tc>
+              <w:tc>
+                <w:tcPr/>
+                <w:p>
+                  <w:pPr>
+                    <w:pStyle w:val="Compact"/>
+                    <w:jc w:val="right"/>
+                    <w:jc w:val="center"/>
+                  </w:pPr>
+                  <w:r>
+                    <w:t xml:space="preserve">5</w:t>
+                  </w:r>
+                </w:p>
+              </w:tc>
+              <w:tc>
+                <w:tcPr/>
+                <w:p>
+                  <w:pPr>
+                    <w:pStyle w:val="Compact"/>
+                    <w:jc w:val="left"/>
+                    <w:jc w:val="center"/>
+                  </w:pPr>
+                  <w:r>
+                    <w:t xml:space="preserve">Antiplatelet</w:t>
+                  </w:r>
+                </w:p>
+              </w:tc>
+              <w:tc>
+                <w:tcPr/>
+                <w:p>
+                  <w:pPr>
+                    <w:pStyle w:val="Compact"/>
+                    <w:jc w:val="right"/>
+                    <w:jc w:val="center"/>
+                  </w:pPr>
+                  <w:r>
+                    <w:t xml:space="preserve">0.0008220</w:t>
+                  </w:r>
+                </w:p>
+              </w:tc>
+            </w:tr>
+            <w:tr>
+              <w:tc>
+                <w:tcPr/>
+                <w:p>
+                  <w:pPr>
+                    <w:pStyle w:val="Compact"/>
+                    <w:jc w:val="left"/>
+                    <w:jc w:val="center"/>
+                  </w:pPr>
+                  <w:r>
+                    <w:t xml:space="preserve">Received</w:t>
+                  </w:r>
+                </w:p>
+              </w:tc>
+              <w:tc>
+                <w:tcPr/>
+                <w:p>
+                  <w:pPr>
+                    <w:pStyle w:val="Compact"/>
+                    <w:jc w:val="right"/>
+                    <w:jc w:val="center"/>
+                  </w:pPr>
+                  <w:r>
+                    <w:t xml:space="preserve">6674</w:t>
+                  </w:r>
+                </w:p>
+              </w:tc>
+              <w:tc>
+                <w:tcPr/>
+                <w:p>
+                  <w:pPr>
+                    <w:pStyle w:val="Compact"/>
+                    <w:jc w:val="right"/>
+                    <w:jc w:val="center"/>
+                  </w:pPr>
+                  <w:r>
+                    <w:t xml:space="preserve">8</w:t>
+                  </w:r>
+                </w:p>
+              </w:tc>
+              <w:tc>
+                <w:tcPr/>
+                <w:p>
+                  <w:pPr>
+                    <w:pStyle w:val="Compact"/>
+                    <w:jc w:val="left"/>
+                    <w:jc w:val="center"/>
+                  </w:pPr>
+                  <w:r>
+                    <w:t xml:space="preserve">Antiplatelet</w:t>
+                  </w:r>
+                </w:p>
+              </w:tc>
+              <w:tc>
+                <w:tcPr/>
+                <w:p>
+                  <w:pPr>
+                    <w:pStyle w:val="Compact"/>
+                    <w:jc w:val="right"/>
+                    <w:jc w:val="center"/>
+                  </w:pPr>
+                  <w:r>
+                    <w:t xml:space="preserve">0.0011987</w:t>
+                  </w:r>
+                </w:p>
+              </w:tc>
+            </w:tr>
+            <w:tr>
+              <w:tc>
+                <w:tcPr/>
+                <w:p>
+                  <w:pPr>
+                    <w:pStyle w:val="Compact"/>
+                    <w:jc w:val="left"/>
+                    <w:jc w:val="center"/>
+                  </w:pPr>
+                  <w:r>
+                    <w:t xml:space="preserve">Not Received</w:t>
+                  </w:r>
+                </w:p>
+              </w:tc>
+              <w:tc>
+                <w:tcPr/>
+                <w:p>
+                  <w:pPr>
+                    <w:pStyle w:val="Compact"/>
+                    <w:jc w:val="right"/>
+                    <w:jc w:val="center"/>
+                  </w:pPr>
+                  <w:r>
+                    <w:t xml:space="preserve">5920</w:t>
+                  </w:r>
+                </w:p>
+              </w:tc>
+              <w:tc>
+                <w:tcPr/>
+                <w:p>
+                  <w:pPr>
+                    <w:pStyle w:val="Compact"/>
+                    <w:jc w:val="right"/>
+                    <w:jc w:val="center"/>
+                  </w:pPr>
+                  <w:r>
+                    <w:t xml:space="preserve">3</w:t>
+                  </w:r>
+                </w:p>
+              </w:tc>
+              <w:tc>
+                <w:tcPr/>
+                <w:p>
+                  <w:pPr>
+                    <w:pStyle w:val="Compact"/>
+                    <w:jc w:val="left"/>
+                    <w:jc w:val="center"/>
+                  </w:pPr>
+                  <w:r>
+                    <w:t xml:space="preserve">Anticoagulant</w:t>
+                  </w:r>
+                </w:p>
+              </w:tc>
+              <w:tc>
+                <w:tcPr/>
+                <w:p>
+                  <w:pPr>
+                    <w:pStyle w:val="Compact"/>
+                    <w:jc w:val="right"/>
+                    <w:jc w:val="center"/>
+                  </w:pPr>
+                  <w:r>
+                    <w:t xml:space="preserve">0.0005068</w:t>
+                  </w:r>
+                </w:p>
+              </w:tc>
+            </w:tr>
+            <w:tr>
+              <w:tc>
+                <w:tcPr/>
+                <w:p>
+                  <w:pPr>
+                    <w:pStyle w:val="Compact"/>
+                    <w:jc w:val="left"/>
+                    <w:jc w:val="center"/>
+                  </w:pPr>
+                  <w:r>
+                    <w:t xml:space="preserve">Received</w:t>
+                  </w:r>
+                </w:p>
+              </w:tc>
+              <w:tc>
+                <w:tcPr/>
+                <w:p>
+                  <w:pPr>
+                    <w:pStyle w:val="Compact"/>
+                    <w:jc w:val="right"/>
+                    <w:jc w:val="center"/>
+                  </w:pPr>
+                  <w:r>
+                    <w:t xml:space="preserve">6837</w:t>
+                  </w:r>
+                </w:p>
+              </w:tc>
+              <w:tc>
+                <w:tcPr/>
+                <w:p>
+                  <w:pPr>
+                    <w:pStyle w:val="Compact"/>
+                    <w:jc w:val="right"/>
+                    <w:jc w:val="center"/>
+                  </w:pPr>
+                  <w:r>
+                    <w:t xml:space="preserve">10</w:t>
+                  </w:r>
+                </w:p>
+              </w:tc>
+              <w:tc>
+                <w:tcPr/>
+                <w:p>
+                  <w:pPr>
+                    <w:pStyle w:val="Compact"/>
+                    <w:jc w:val="left"/>
+                    <w:jc w:val="center"/>
+                  </w:pPr>
+                  <w:r>
+                    <w:t xml:space="preserve">Anticoagulant</w:t>
+                  </w:r>
+                </w:p>
+              </w:tc>
+              <w:tc>
+                <w:tcPr/>
+                <w:p>
+                  <w:pPr>
+                    <w:pStyle w:val="Compact"/>
+                    <w:jc w:val="right"/>
+                    <w:jc w:val="center"/>
+                  </w:pPr>
+                  <w:r>
+                    <w:t xml:space="preserve">0.0014626</w:t>
+                  </w:r>
+                </w:p>
+              </w:tc>
+            </w:tr>
+            <w:tr>
+              <w:tc>
+                <w:tcPr/>
+                <w:p>
+                  <w:pPr>
+                    <w:pStyle w:val="Compact"/>
+                    <w:jc w:val="left"/>
+                    <w:jc w:val="center"/>
+                  </w:pPr>
+                  <w:r>
+                    <w:t xml:space="preserve">Not Received</w:t>
+                  </w:r>
+                </w:p>
+              </w:tc>
+              <w:tc>
+                <w:tcPr/>
+                <w:p>
+                  <w:pPr>
+                    <w:pStyle w:val="Compact"/>
+                    <w:jc w:val="right"/>
+                    <w:jc w:val="center"/>
+                  </w:pPr>
+                  <w:r>
+                    <w:t xml:space="preserve">6139</w:t>
+                  </w:r>
+                </w:p>
+              </w:tc>
+              <w:tc>
+                <w:tcPr/>
+                <w:p>
+                  <w:pPr>
+                    <w:pStyle w:val="Compact"/>
+                    <w:jc w:val="right"/>
+                    <w:jc w:val="center"/>
+                  </w:pPr>
+                  <w:r>
+                    <w:t xml:space="preserve">8</w:t>
+                  </w:r>
+                </w:p>
+              </w:tc>
+              <w:tc>
+                <w:tcPr/>
+                <w:p>
+                  <w:pPr>
+                    <w:pStyle w:val="Compact"/>
+                    <w:jc w:val="left"/>
+                    <w:jc w:val="center"/>
+                  </w:pPr>
+                  <w:r>
+                    <w:t xml:space="preserve">Ace Inhibitor</w:t>
+                  </w:r>
+                </w:p>
+              </w:tc>
+              <w:tc>
+                <w:tcPr/>
+                <w:p>
+                  <w:pPr>
+                    <w:pStyle w:val="Compact"/>
+                    <w:jc w:val="right"/>
+                    <w:jc w:val="center"/>
+                  </w:pPr>
+                  <w:r>
+                    <w:t xml:space="preserve">0.0013031</w:t>
+                  </w:r>
+                </w:p>
+              </w:tc>
+            </w:tr>
+            <w:tr>
+              <w:tc>
+                <w:tcPr/>
+                <w:p>
+                  <w:pPr>
+                    <w:pStyle w:val="Compact"/>
+                    <w:jc w:val="left"/>
+                    <w:jc w:val="center"/>
+                  </w:pPr>
+                  <w:r>
+                    <w:t xml:space="preserve">Received</w:t>
+                  </w:r>
+                </w:p>
+              </w:tc>
+              <w:tc>
+                <w:tcPr/>
+                <w:p>
+                  <w:pPr>
+                    <w:pStyle w:val="Compact"/>
+                    <w:jc w:val="right"/>
+                    <w:jc w:val="center"/>
+                  </w:pPr>
+                  <w:r>
+                    <w:t xml:space="preserve">6618</w:t>
+                  </w:r>
+                </w:p>
+              </w:tc>
+              <w:tc>
+                <w:tcPr/>
+                <w:p>
+                  <w:pPr>
+                    <w:pStyle w:val="Compact"/>
+                    <w:jc w:val="right"/>
+                    <w:jc w:val="center"/>
+                  </w:pPr>
+                  <w:r>
+                    <w:t xml:space="preserve">5</w:t>
+                  </w:r>
+                </w:p>
+              </w:tc>
+              <w:tc>
+                <w:tcPr/>
+                <w:p>
+                  <w:pPr>
+                    <w:pStyle w:val="Compact"/>
+                    <w:jc w:val="left"/>
+                    <w:jc w:val="center"/>
+                  </w:pPr>
+                  <w:r>
+                    <w:t xml:space="preserve">Ace Inhibitor</w:t>
+                  </w:r>
+                </w:p>
+              </w:tc>
+              <w:tc>
+                <w:tcPr/>
+                <w:p>
+                  <w:pPr>
+                    <w:pStyle w:val="Compact"/>
+                    <w:jc w:val="right"/>
+                    <w:jc w:val="center"/>
+                  </w:pPr>
+                  <w:r>
+                    <w:t xml:space="preserve">0.0007555</w:t>
+                  </w:r>
+                </w:p>
+              </w:tc>
+            </w:tr>
+            <w:tr>
+              <w:tc>
+                <w:tcPr/>
+                <w:p>
+                  <w:pPr>
+                    <w:pStyle w:val="Compact"/>
+                    <w:jc w:val="left"/>
+                    <w:jc w:val="center"/>
+                  </w:pPr>
+                  <w:r>
+                    <w:t xml:space="preserve">Not Received</w:t>
+                  </w:r>
+                </w:p>
+              </w:tc>
+              <w:tc>
+                <w:tcPr/>
+                <w:p>
+                  <w:pPr>
+                    <w:pStyle w:val="Compact"/>
+                    <w:jc w:val="right"/>
+                    <w:jc w:val="center"/>
+                  </w:pPr>
+                  <w:r>
+                    <w:t xml:space="preserve">6095</w:t>
+                  </w:r>
+                </w:p>
+              </w:tc>
+              <w:tc>
+                <w:tcPr/>
+                <w:p>
+                  <w:pPr>
+                    <w:pStyle w:val="Compact"/>
+                    <w:jc w:val="right"/>
+                    <w:jc w:val="center"/>
+                  </w:pPr>
+                  <w:r>
+                    <w:t xml:space="preserve">3</w:t>
+                  </w:r>
+                </w:p>
+              </w:tc>
+              <w:tc>
+                <w:tcPr/>
+                <w:p>
+                  <w:pPr>
+                    <w:pStyle w:val="Compact"/>
+                    <w:jc w:val="left"/>
+                    <w:jc w:val="center"/>
+                  </w:pPr>
+                  <w:r>
+                    <w:t xml:space="preserve">Diuretic</w:t>
+                  </w:r>
+                </w:p>
+              </w:tc>
+              <w:tc>
+                <w:tcPr/>
+                <w:p>
+                  <w:pPr>
+                    <w:pStyle w:val="Compact"/>
+                    <w:jc w:val="right"/>
+                    <w:jc w:val="center"/>
+                  </w:pPr>
+                  <w:r>
+                    <w:t xml:space="preserve">0.0004922</w:t>
+                  </w:r>
+                </w:p>
+              </w:tc>
+            </w:tr>
+            <w:tr>
+              <w:tc>
+                <w:tcPr/>
+                <w:p>
+                  <w:pPr>
+                    <w:pStyle w:val="Compact"/>
+                    <w:jc w:val="left"/>
+                    <w:jc w:val="center"/>
+                  </w:pPr>
+                  <w:r>
+                    <w:t xml:space="preserve">Received</w:t>
+                  </w:r>
+                </w:p>
+              </w:tc>
+              <w:tc>
+                <w:tcPr/>
+                <w:p>
+                  <w:pPr>
+                    <w:pStyle w:val="Compact"/>
+                    <w:jc w:val="right"/>
+                    <w:jc w:val="center"/>
+                  </w:pPr>
+                  <w:r>
+                    <w:t xml:space="preserve">6662</w:t>
+                  </w:r>
+                </w:p>
+              </w:tc>
+              <w:tc>
+                <w:tcPr/>
+                <w:p>
+                  <w:pPr>
+                    <w:pStyle w:val="Compact"/>
+                    <w:jc w:val="right"/>
+                    <w:jc w:val="center"/>
+                  </w:pPr>
+                  <w:r>
+                    <w:t xml:space="preserve">10</w:t>
+                  </w:r>
+                </w:p>
+              </w:tc>
+              <w:tc>
+                <w:tcPr/>
+                <w:p>
+                  <w:pPr>
+                    <w:pStyle w:val="Compact"/>
+                    <w:jc w:val="left"/>
+                    <w:jc w:val="center"/>
+                  </w:pPr>
+                  <w:r>
+                    <w:t xml:space="preserve">Diuretic</w:t>
+                  </w:r>
+                </w:p>
+              </w:tc>
+              <w:tc>
+                <w:tcPr/>
+                <w:p>
+                  <w:pPr>
+                    <w:pStyle w:val="Compact"/>
+                    <w:jc w:val="right"/>
+                    <w:jc w:val="center"/>
+                  </w:pPr>
+                  <w:r>
+                    <w:t xml:space="preserve">0.0015011</w:t>
+                  </w:r>
+                </w:p>
+              </w:tc>
+            </w:tr>
+            <w:tr>
+              <w:tc>
+                <w:tcPr/>
+                <w:p>
+                  <w:pPr>
+                    <w:pStyle w:val="Compact"/>
+                    <w:jc w:val="left"/>
+                    <w:jc w:val="center"/>
+                  </w:pPr>
+                  <w:r>
+                    <w:t xml:space="preserve">Not Received</w:t>
+                  </w:r>
+                </w:p>
+              </w:tc>
+              <w:tc>
+                <w:tcPr/>
+                <w:p>
+                  <w:pPr>
+                    <w:pStyle w:val="Compact"/>
+                    <w:jc w:val="right"/>
+                    <w:jc w:val="center"/>
+                  </w:pPr>
+                  <w:r>
+                    <w:t xml:space="preserve">6030</w:t>
+                  </w:r>
+                </w:p>
+              </w:tc>
+              <w:tc>
+                <w:tcPr/>
+                <w:p>
+                  <w:pPr>
+                    <w:pStyle w:val="Compact"/>
+                    <w:jc w:val="right"/>
+                    <w:jc w:val="center"/>
+                  </w:pPr>
+                  <w:r>
+                    <w:t xml:space="preserve">10</w:t>
+                  </w:r>
+                </w:p>
+              </w:tc>
+              <w:tc>
+                <w:tcPr/>
+                <w:p>
+                  <w:pPr>
+                    <w:pStyle w:val="Compact"/>
+                    <w:jc w:val="left"/>
+                    <w:jc w:val="center"/>
+                  </w:pPr>
+                  <w:r>
+                    <w:t xml:space="preserve">Insulin</w:t>
+                  </w:r>
+                </w:p>
+              </w:tc>
+              <w:tc>
+                <w:tcPr/>
+                <w:p>
+                  <w:pPr>
+                    <w:pStyle w:val="Compact"/>
+                    <w:jc w:val="right"/>
+                    <w:jc w:val="center"/>
+                  </w:pPr>
+                  <w:r>
+                    <w:t xml:space="preserve">0.0016584</w:t>
+                  </w:r>
+                </w:p>
+              </w:tc>
+            </w:tr>
+            <w:tr>
+              <w:tc>
+                <w:tcPr/>
+                <w:p>
+                  <w:pPr>
+                    <w:pStyle w:val="Compact"/>
+                    <w:jc w:val="left"/>
+                    <w:jc w:val="center"/>
+                  </w:pPr>
+                  <w:r>
+                    <w:t xml:space="preserve">Received</w:t>
+                  </w:r>
+                </w:p>
+              </w:tc>
+              <w:tc>
+                <w:tcPr/>
+                <w:p>
+                  <w:pPr>
+                    <w:pStyle w:val="Compact"/>
+                    <w:jc w:val="right"/>
+                    <w:jc w:val="center"/>
+                  </w:pPr>
+                  <w:r>
+                    <w:t xml:space="preserve">6727</w:t>
+                  </w:r>
+                </w:p>
+              </w:tc>
+              <w:tc>
+                <w:tcPr/>
+                <w:p>
+                  <w:pPr>
+                    <w:pStyle w:val="Compact"/>
+                    <w:jc w:val="right"/>
+                    <w:jc w:val="center"/>
+                  </w:pPr>
+                  <w:r>
+                    <w:t xml:space="preserve">3</w:t>
+                  </w:r>
+                </w:p>
+              </w:tc>
+              <w:tc>
+                <w:tcPr/>
+                <w:p>
+                  <w:pPr>
+                    <w:pStyle w:val="Compact"/>
+                    <w:jc w:val="left"/>
+                    <w:jc w:val="center"/>
+                  </w:pPr>
+                  <w:r>
+                    <w:t xml:space="preserve">Insulin</w:t>
+                  </w:r>
+                </w:p>
+              </w:tc>
+              <w:tc>
+                <w:tcPr/>
+                <w:p>
+                  <w:pPr>
+                    <w:pStyle w:val="Compact"/>
+                    <w:jc w:val="right"/>
+                    <w:jc w:val="center"/>
+                  </w:pPr>
+                  <w:r>
+                    <w:t xml:space="preserve">0.0004460</w:t>
+                  </w:r>
+                </w:p>
+              </w:tc>
+            </w:tr>
+            <w:tr>
+              <w:tc>
+                <w:tcPr/>
+                <w:p>
+                  <w:pPr>
+                    <w:pStyle w:val="Compact"/>
+                    <w:jc w:val="left"/>
+                    <w:jc w:val="center"/>
+                  </w:pPr>
+                  <w:r>
+                    <w:t xml:space="preserve">Not Received</w:t>
+                  </w:r>
+                </w:p>
+              </w:tc>
+              <w:tc>
+                <w:tcPr/>
+                <w:p>
+                  <w:pPr>
+                    <w:pStyle w:val="Compact"/>
+                    <w:jc w:val="right"/>
+                    <w:jc w:val="center"/>
+                  </w:pPr>
+                  <w:r>
+                    <w:t xml:space="preserve">6004</w:t>
+                  </w:r>
+                </w:p>
+              </w:tc>
+              <w:tc>
+                <w:tcPr/>
+                <w:p>
+                  <w:pPr>
+                    <w:pStyle w:val="Compact"/>
+                    <w:jc w:val="right"/>
+                    <w:jc w:val="center"/>
+                  </w:pPr>
+                  <w:r>
+                    <w:t xml:space="preserve">6</w:t>
+                  </w:r>
+                </w:p>
+              </w:tc>
+              <w:tc>
+                <w:tcPr/>
+                <w:p>
+                  <w:pPr>
+                    <w:pStyle w:val="Compact"/>
+                    <w:jc w:val="left"/>
+                    <w:jc w:val="center"/>
+                  </w:pPr>
+                  <w:r>
+                    <w:t xml:space="preserve">Statin</w:t>
+                  </w:r>
+                </w:p>
+              </w:tc>
+              <w:tc>
+                <w:tcPr/>
+                <w:p>
+                  <w:pPr>
+                    <w:pStyle w:val="Compact"/>
+                    <w:jc w:val="right"/>
+                    <w:jc w:val="center"/>
+                  </w:pPr>
+                  <w:r>
+                    <w:t xml:space="preserve">0.0009993</w:t>
+                  </w:r>
+                </w:p>
+              </w:tc>
+            </w:tr>
+            <w:tr>
+              <w:tc>
+                <w:tcPr/>
+                <w:p>
+                  <w:pPr>
+                    <w:pStyle w:val="Compact"/>
+                    <w:jc w:val="left"/>
+                    <w:jc w:val="center"/>
+                  </w:pPr>
+                  <w:r>
+                    <w:t xml:space="preserve">Received</w:t>
+                  </w:r>
+                </w:p>
+              </w:tc>
+              <w:tc>
+                <w:tcPr/>
+                <w:p>
+                  <w:pPr>
+                    <w:pStyle w:val="Compact"/>
+                    <w:jc w:val="right"/>
+                    <w:jc w:val="center"/>
+                  </w:pPr>
+                  <w:r>
+                    <w:t xml:space="preserve">6753</w:t>
+                  </w:r>
+                </w:p>
+              </w:tc>
+              <w:tc>
+                <w:tcPr/>
+                <w:p>
+                  <w:pPr>
+                    <w:pStyle w:val="Compact"/>
+                    <w:jc w:val="right"/>
+                    <w:jc w:val="center"/>
+                  </w:pPr>
+                  <w:r>
+                    <w:t xml:space="preserve">7</w:t>
+                  </w:r>
+                </w:p>
+              </w:tc>
+              <w:tc>
+                <w:tcPr/>
+                <w:p>
+                  <w:pPr>
+                    <w:pStyle w:val="Compact"/>
+                    <w:jc w:val="left"/>
+                    <w:jc w:val="center"/>
+                  </w:pPr>
+                  <w:r>
+                    <w:t xml:space="preserve">Statin</w:t>
+                  </w:r>
+                </w:p>
+              </w:tc>
+              <w:tc>
+                <w:tcPr/>
+                <w:p>
+                  <w:pPr>
+                    <w:pStyle w:val="Compact"/>
+                    <w:jc w:val="right"/>
+                    <w:jc w:val="center"/>
+                  </w:pPr>
+                  <w:r>
+                    <w:t xml:space="preserve">0.0010366</w:t>
+                  </w:r>
+                </w:p>
+              </w:tc>
+            </w:tr>
+          </w:tbl>
+          <w:bookmarkEnd w:id="52"/>
+          <w:p/>
+        </w:tc>
+      </w:tr>
+    </w:tbl>
+    <w:p>
+      <w:pPr>
+        <w:pStyle w:val="BodyText"/>
+      </w:pPr>
+      <w:hyperlink w:anchor="tbl-med-mortality-summary">
+        <w:r>
+          <w:rPr>
+            <w:rStyle w:val="Hyperlink"/>
+          </w:rPr>
+          <w:t xml:space="preserve">Table 2</w:t>
+        </w:r>
+      </w:hyperlink>
+      <w:r>
+        <w:t xml:space="preserve"> </w:t>
+      </w:r>
+      <w:r>
+        <w:t xml:space="preserve">shows mortality rates were higher with patients taking vasopressors, sedatives, and diruetics; this could be because the severity of their illness.</w:t>
+      </w:r>
+    </w:p>
+    <w:p>
+      <w:pPr>
+        <w:pStyle w:val="SourceCode"/>
+      </w:pPr>
+      <w:r>
+        <w:rPr>
+          <w:rStyle w:val="NormalTok"/>
+        </w:rPr>
+        <w:t xml:space="preserve">knitr</w:t>
+      </w:r>
+      <w:r>
+        <w:rPr>
+          <w:rStyle w:val="SpecialCharTok"/>
+        </w:rPr>
+        <w:t xml:space="preserve">::</w:t>
+      </w:r>
+      <w:r>
+        <w:rPr>
+          <w:rStyle w:val="FunctionTok"/>
+        </w:rPr>
+        <w:t xml:space="preserve">include_graphics</w:t>
+      </w:r>
+      <w:r>
+        <w:rPr>
+          <w:rStyle w:val="NormalTok"/>
+        </w:rPr>
+        <w:t xml:space="preserve">(</w:t>
+      </w:r>
+      <w:r>
+        <w:rPr>
+          <w:rStyle w:val="FunctionTok"/>
+        </w:rPr>
+        <w:t xml:space="preserve">here</w:t>
+      </w:r>
+      <w:r>
+        <w:rPr>
+          <w:rStyle w:val="NormalTok"/>
+        </w:rPr>
+        <w:t xml:space="preserve">(</w:t>
+      </w:r>
+      <w:r>
+        <w:rPr>
+          <w:rStyle w:val="StringTok"/>
+        </w:rPr>
+        <w:t xml:space="preserve">"results"</w:t>
+      </w:r>
+      <w:r>
+        <w:rPr>
+          <w:rStyle w:val="NormalTok"/>
+        </w:rPr>
+        <w:t xml:space="preserve">, </w:t>
+      </w:r>
+      <w:r>
+        <w:rPr>
+          <w:rStyle w:val="StringTok"/>
+        </w:rPr>
+        <w:t xml:space="preserve">"figures"</w:t>
+      </w:r>
+      <w:r>
+        <w:rPr>
+          <w:rStyle w:val="NormalTok"/>
+        </w:rPr>
+        <w:t xml:space="preserve">, </w:t>
+      </w:r>
+      <w:r>
+        <w:rPr>
+          <w:rStyle w:val="StringTok"/>
+        </w:rPr>
+        <w:t xml:space="preserve">"polypharmacy-frequency.png"</w:t>
+      </w:r>
+      <w:r>
+        <w:rPr>
+          <w:rStyle w:val="NormalTok"/>
+        </w:rPr>
+        <w:t xml:space="preserve">))</w:t>
+      </w:r>
+    </w:p>
+    <w:tbl>
+      <w:tblPr>
+        <w:tblStyle w:val="Table"/>
+        <w:tblW w:type="pct" w:w="5000"/>
+        <w:tblLayout w:type="fixed"/>
+        <w:tblLook w:firstRow="0" w:lastRow="0" w:firstColumn="0" w:lastColumn="0" w:noHBand="0" w:noVBand="0" w:val="0000"/>
+      </w:tblPr>
+      <w:tblGrid>
+        <w:gridCol w:w="7920"/>
+      </w:tblGrid>
+      <w:tr>
+        <w:tc>
+          <w:tcPr/>
+          <w:bookmarkStart w:id="56" w:name="fig-polypharmacy-freq"/>
+          <w:p>
+            <w:pPr>
+              <w:pStyle w:val="Compact"/>
+              <w:jc w:val="center"/>
+            </w:pPr>
+            <w:r>
+              <w:drawing>
+                <wp:inline>
+                  <wp:extent cx="5334000" cy="3333749"/>
+                  <wp:effectExtent b="0" l="0" r="0" t="0"/>
+                  <wp:docPr descr="" title="" id="54" name="Picture"/>
+                  <a:graphic>
+                    <a:graphicData uri="http://schemas.openxmlformats.org/drawingml/2006/picture">
+                      <pic:pic>
+                        <pic:nvPicPr>
+                          <pic:cNvPr descr="../../results/figures/polypharmacy-frequency.png" id="55" name="Picture"/>
+                          <pic:cNvPicPr>
+                            <a:picLocks noChangeArrowheads="1" noChangeAspect="1"/>
+                          </pic:cNvPicPr>
+                        </pic:nvPicPr>
+                        <pic:blipFill>
+                          <a:blip r:embed="rId53"/>
+                          <a:stretch>
+                            <a:fillRect/>
+                          </a:stretch>
+                        </pic:blipFill>
+                        <pic:spPr bwMode="auto">
+                          <a:xfrm>
+                            <a:off x="0" y="0"/>
+                            <a:ext cx="5334000" cy="3333749"/>
+                          </a:xfrm>
+                          <a:prstGeom prst="rect">
+                            <a:avLst/>
+                          </a:prstGeom>
+                          <a:noFill/>
+                          <a:ln w="9525">
+                            <a:noFill/>
+                            <a:headEnd/>
+                            <a:tailEnd/>
+                          </a:ln>
+                        </pic:spPr>
+                      </pic:pic>
+                    </a:graphicData>
+                  </a:graphic>
+                </wp:inline>
+              </w:drawing>
+            </w:r>
+          </w:p>
+          <w:p>
+            <w:pPr>
+              <w:jc w:val="center"/>
+            </w:pPr>
+            <w:pPr>
+              <w:jc w:val="left"/>
+              <w:spacing w:before="200"/>
+              <w:pStyle w:val="ImageCaption"/>
+            </w:pPr>
+            <w:r>
+              <w:t xml:space="preserve">Figure 6: Number of medication classes received vs. 30-day mortality</w:t>
+            </w:r>
+          </w:p>
+          <w:bookmarkEnd w:id="56"/>
+        </w:tc>
+      </w:tr>
+    </w:tbl>
+    <w:p>
+      <w:pPr>
+        <w:pStyle w:val="BodyText"/>
+      </w:pPr>
+      <w:hyperlink w:anchor="fig-polypharmacy-freq">
+        <w:r>
+          <w:rPr>
+            <w:rStyle w:val="Hyperlink"/>
+          </w:rPr>
+          <w:t xml:space="preserve">Figure 6</w:t>
+        </w:r>
+      </w:hyperlink>
+      <w:r>
+        <w:t xml:space="preserve"> </w:t>
+      </w:r>
+      <w:r>
         <w:t xml:space="preserve">shows mortality increased as the number of medications increased, this also could be explained by the increasing severity of illness as more medications were needed.</w:t>
       </w:r>
     </w:p>
-    <w:bookmarkEnd w:id="53"/>
-    <w:bookmarkStart w:id="54" w:name="basic-statistical-analysis"/>
+    <w:bookmarkEnd w:id="57"/>
+    <w:bookmarkStart w:id="58" w:name="basic-statistical-analysis"/>
     <w:p>
       <w:pPr>
         <w:pStyle w:val="Heading2"/>
@@ -3444,8 +2834,8 @@
         <w:t xml:space="preserve">shows a scatterplot figure produced by one of the R scripts.</w:t>
       </w:r>
     </w:p>
-    <w:bookmarkEnd w:id="54"/>
-    <w:bookmarkStart w:id="55" w:name="full-analysis"/>
+    <w:bookmarkEnd w:id="58"/>
+    <w:bookmarkStart w:id="59" w:name="full-analysis"/>
     <w:p>
       <w:pPr>
         <w:pStyle w:val="Heading2"/>
@@ -3471,9 +2861,9 @@
         <w:br w:type="page"/>
       </w:r>
     </w:p>
-    <w:bookmarkEnd w:id="55"/>
-    <w:bookmarkEnd w:id="56"/>
-    <w:bookmarkStart w:id="61" w:name="discussion"/>
+    <w:bookmarkEnd w:id="59"/>
+    <w:bookmarkEnd w:id="60"/>
+    <w:bookmarkStart w:id="65" w:name="discussion"/>
     <w:p>
       <w:pPr>
         <w:pStyle w:val="Heading1"/>
@@ -3482,7 +2872,7 @@
         <w:t xml:space="preserve">5. Discussion</w:t>
       </w:r>
     </w:p>
-    <w:bookmarkStart w:id="57" w:name="summary-and-interpretation"/>
+    <w:bookmarkStart w:id="61" w:name="summary-and-interpretation"/>
     <w:p>
       <w:pPr>
         <w:pStyle w:val="Heading2"/>
@@ -3503,8 +2893,8 @@
         <w:t xml:space="preserve">Summarize what you did, what you found and what it means.</w:t>
       </w:r>
     </w:p>
-    <w:bookmarkEnd w:id="57"/>
-    <w:bookmarkStart w:id="58" w:name="strengths-and-limitations"/>
+    <w:bookmarkEnd w:id="61"/>
+    <w:bookmarkStart w:id="62" w:name="strengths-and-limitations"/>
     <w:p>
       <w:pPr>
         <w:pStyle w:val="Heading2"/>
@@ -3525,8 +2915,8 @@
         <w:t xml:space="preserve">Discuss what you perceive as strengths and limitations of your analysis.</w:t>
       </w:r>
     </w:p>
-    <w:bookmarkEnd w:id="58"/>
-    <w:bookmarkStart w:id="60" w:name="conclusions"/>
+    <w:bookmarkEnd w:id="62"/>
+    <w:bookmarkStart w:id="64" w:name="conclusions"/>
     <w:p>
       <w:pPr>
         <w:pStyle w:val="Heading2"/>
@@ -3609,7 +2999,7 @@
       <w:r>
         <w:t xml:space="preserve"> </w:t>
       </w:r>
-      <w:hyperlink r:id="rId59">
+      <w:hyperlink r:id="rId63">
         <w:r>
           <w:rPr>
             <w:rStyle w:val="Hyperlink"/>
@@ -3626,9 +3016,9 @@
         <w:br w:type="page"/>
       </w:r>
     </w:p>
-    <w:bookmarkEnd w:id="60"/>
-    <w:bookmarkEnd w:id="61"/>
-    <w:bookmarkStart w:id="69" w:name="references"/>
+    <w:bookmarkEnd w:id="64"/>
+    <w:bookmarkEnd w:id="65"/>
+    <w:bookmarkStart w:id="73" w:name="references"/>
     <w:p>
       <w:pPr>
         <w:pStyle w:val="Heading1"/>
@@ -3637,8 +3027,8 @@
         <w:t xml:space="preserve">6. References</w:t>
       </w:r>
     </w:p>
-    <w:bookmarkStart w:id="68" w:name="refs"/>
-    <w:bookmarkStart w:id="63" w:name="ref-leek2015"/>
+    <w:bookmarkStart w:id="72" w:name="refs"/>
+    <w:bookmarkStart w:id="67" w:name="ref-leek2015"/>
     <w:p>
       <w:pPr>
         <w:pStyle w:val="Bibliography"/>
@@ -3658,7 +3048,7 @@
       <w:r>
         <w:t xml:space="preserve"> </w:t>
       </w:r>
-      <w:hyperlink r:id="rId62">
+      <w:hyperlink r:id="rId66">
         <w:r>
           <w:rPr>
             <w:rStyle w:val="Hyperlink"/>
@@ -3707,8 +3097,8 @@
         <w:t xml:space="preserve"> </w:t>
       </w:r>
     </w:p>
-    <w:bookmarkEnd w:id="63"/>
-    <w:bookmarkStart w:id="65" w:name="ref-mckay2020"/>
+    <w:bookmarkEnd w:id="67"/>
+    <w:bookmarkStart w:id="69" w:name="ref-mckay2020"/>
     <w:p>
       <w:pPr>
         <w:pStyle w:val="Bibliography"/>
@@ -3728,7 +3118,7 @@
       <w:r>
         <w:t xml:space="preserve"> </w:t>
       </w:r>
-      <w:hyperlink r:id="rId64">
+      <w:hyperlink r:id="rId68">
         <w:r>
           <w:rPr>
             <w:rStyle w:val="Hyperlink"/>
@@ -3843,8 +3233,8 @@
         <w:t xml:space="preserve"> </w:t>
       </w:r>
     </w:p>
-    <w:bookmarkEnd w:id="65"/>
-    <w:bookmarkStart w:id="67" w:name="ref-mckay2020a"/>
+    <w:bookmarkEnd w:id="69"/>
+    <w:bookmarkStart w:id="71" w:name="ref-mckay2020a"/>
     <w:p>
       <w:pPr>
         <w:pStyle w:val="Bibliography"/>
@@ -3864,7 +3254,7 @@
       <w:r>
         <w:t xml:space="preserve"> </w:t>
       </w:r>
-      <w:hyperlink r:id="rId66">
+      <w:hyperlink r:id="rId70">
         <w:r>
           <w:rPr>
             <w:rStyle w:val="Hyperlink"/>
@@ -3889,9 +3279,9 @@
         <w:t xml:space="preserve"> </w:t>
       </w:r>
     </w:p>
-    <w:bookmarkEnd w:id="67"/>
-    <w:bookmarkEnd w:id="68"/>
-    <w:bookmarkEnd w:id="69"/>
+    <w:bookmarkEnd w:id="71"/>
+    <w:bookmarkEnd w:id="72"/>
+    <w:bookmarkEnd w:id="73"/>
     <w:sectPr>
       <w:footnotePr>
         <w:numRestart w:val="eachSect"/>

</xml_diff>